<commit_message>
docs: sync Agent evaluation deployment guides
</commit_message>
<xml_diff>
--- a/docs/00-项目说明文档.docx
+++ b/docs/00-项目说明文档.docx
@@ -138,7 +138,7 @@
                 <w:szCs w:val="24"/>
                 <w:rFonts w:eastAsia="Microsoft YaHei" w:ascii="Arial"/>
               </w:rPr>
-              <w:t xml:space="preserve">更新时间: 2026-09-06</w:t>
+              <w:t xml:space="preserve">更新时间: 2026-10-11</w:t>
             </w:r>
           </w:p>
           <w:p>
@@ -156,7 +156,7 @@
                 <w:szCs w:val="24"/>
                 <w:rFonts w:eastAsia="Microsoft YaHei" w:ascii="Arial"/>
               </w:rPr>
-              <w:t xml:space="preserve">当前版本: 前端 V8.3 · 后端 V8.4</w:t>
+              <w:t xml:space="preserve">当前版本: 后端 A/B 批 · 前端 Agent 场景增量</w:t>
             </w:r>
           </w:p>
           <w:p>
@@ -174,7 +174,7 @@
                 <w:szCs w:val="24"/>
                 <w:rFonts w:eastAsia="Microsoft YaHei" w:ascii="Arial"/>
               </w:rPr>
-              <w:t xml:space="preserve">适用环境: S/4HANA 760 · SAP 网关 client 470</w:t>
+              <w:t xml:space="preserve">适用环境: S/4HANA 760 · SAP 网关 client 470（SAP_BASIS 以现场实测为准）</w:t>
             </w:r>
           </w:p>
           <w:p>
@@ -220,6 +220,7 @@
         <w:sectPr>
           <w:pgSz w:w="11906" w:h="16838" w:orient="portrait"/>
           <w:pgMar w:top="0" w:right="0" w:bottom="0" w:left="0" w:header="708" w:footer="708" w:gutter="0"/>
+          <w:pgNumType/>
           <w:docGrid w:linePitch="360"/>
         </w:sectPr>
       </w:pPr>
@@ -249,654 +250,9 @@
         <w:p>
           <w:r>
             <w:fldChar w:fldCharType="begin" w:dirty="true"/>
-          </w:r>
-          <w:r>
             <w:instrText xml:space="preserve">TOC \h \o "1-3"</w:instrText>
-          </w:r>
-          <w:r>
             <w:fldChar w:fldCharType="separate"/>
           </w:r>
-        </w:p>
-        <w:p>
-          <w:pPr>
-            <w:pStyle w:val="9"/>
-            <w:tabs>
-              <w:tab w:val="right" w:leader="dot" w:pos="9026"/>
-            </w:tabs>
-            <w:spacing w:before="120" w:after="60"/>
-          </w:pPr>
-          <w:hyperlink w:anchor="_Toc100000" w:history="1">
-            <w:r>
-              <w:rPr>
-                <w:rStyle w:val="Hyperlink"/>
-              </w:rPr>
-              <w:t>一、这是什么</w:t>
-            </w:r>
-            <w:r>
-              <w:tab/>
-            </w:r>
-            <w:r>
-              <w:fldChar w:fldCharType="begin"/>
-            </w:r>
-            <w:r>
-              <w:instrText xml:space="preserve"> PAGEREF _Toc100000 \h </w:instrText>
-            </w:r>
-            <w:r>
-              <w:fldChar w:fldCharType="separate"/>
-            </w:r>
-            <w:r>
-              <w:t>2</w:t>
-            </w:r>
-            <w:r>
-              <w:fldChar w:fldCharType="end"/>
-            </w:r>
-          </w:hyperlink>
-        </w:p>
-        <w:p>
-          <w:pPr>
-            <w:pStyle w:val="9"/>
-            <w:tabs>
-              <w:tab w:val="right" w:leader="dot" w:pos="9026"/>
-            </w:tabs>
-            <w:spacing w:before="120" w:after="60"/>
-          </w:pPr>
-          <w:hyperlink w:anchor="_Toc100001" w:history="1">
-            <w:r>
-              <w:rPr>
-                <w:rStyle w:val="Hyperlink"/>
-              </w:rPr>
-              <w:t>二、系统全景</w:t>
-            </w:r>
-            <w:r>
-              <w:tab/>
-            </w:r>
-            <w:r>
-              <w:fldChar w:fldCharType="begin"/>
-            </w:r>
-            <w:r>
-              <w:instrText xml:space="preserve"> PAGEREF _Toc100001 \h </w:instrText>
-            </w:r>
-            <w:r>
-              <w:fldChar w:fldCharType="separate"/>
-            </w:r>
-            <w:r>
-              <w:t>3</w:t>
-            </w:r>
-            <w:r>
-              <w:fldChar w:fldCharType="end"/>
-            </w:r>
-          </w:hyperlink>
-        </w:p>
-        <w:p>
-          <w:pPr>
-            <w:pStyle w:val="11"/>
-            <w:ind w:left="360"/>
-            <w:tabs>
-              <w:tab w:val="right" w:leader="dot" w:pos="9026"/>
-            </w:tabs>
-            <w:spacing w:before="120" w:after="60"/>
-          </w:pPr>
-          <w:hyperlink w:anchor="_Toc100002" w:history="1">
-            <w:r>
-              <w:rPr>
-                <w:rStyle w:val="Hyperlink"/>
-              </w:rPr>
-              <w:t>2.1 架构图</w:t>
-            </w:r>
-            <w:r>
-              <w:tab/>
-            </w:r>
-            <w:r>
-              <w:fldChar w:fldCharType="begin"/>
-            </w:r>
-            <w:r>
-              <w:instrText xml:space="preserve"> PAGEREF _Toc100002 \h </w:instrText>
-            </w:r>
-            <w:r>
-              <w:fldChar w:fldCharType="separate"/>
-            </w:r>
-            <w:r>
-              <w:t>3</w:t>
-            </w:r>
-            <w:r>
-              <w:fldChar w:fldCharType="end"/>
-            </w:r>
-          </w:hyperlink>
-        </w:p>
-        <w:p>
-          <w:pPr>
-            <w:pStyle w:val="11"/>
-            <w:ind w:left="360"/>
-            <w:tabs>
-              <w:tab w:val="right" w:leader="dot" w:pos="9026"/>
-            </w:tabs>
-            <w:spacing w:before="120" w:after="60"/>
-          </w:pPr>
-          <w:hyperlink w:anchor="_Toc100003" w:history="1">
-            <w:r>
-              <w:rPr>
-                <w:rStyle w:val="Hyperlink"/>
-              </w:rPr>
-              <w:t>2.2 关键地址与账号（当前环境实测值）</w:t>
-            </w:r>
-            <w:r>
-              <w:tab/>
-            </w:r>
-            <w:r>
-              <w:fldChar w:fldCharType="begin"/>
-            </w:r>
-            <w:r>
-              <w:instrText xml:space="preserve"> PAGEREF _Toc100003 \h </w:instrText>
-            </w:r>
-            <w:r>
-              <w:fldChar w:fldCharType="separate"/>
-            </w:r>
-            <w:r>
-              <w:t>3</w:t>
-            </w:r>
-            <w:r>
-              <w:fldChar w:fldCharType="end"/>
-            </w:r>
-          </w:hyperlink>
-        </w:p>
-        <w:p>
-          <w:pPr>
-            <w:pStyle w:val="11"/>
-            <w:ind w:left="360"/>
-            <w:tabs>
-              <w:tab w:val="right" w:leader="dot" w:pos="9026"/>
-            </w:tabs>
-            <w:spacing w:before="120" w:after="60"/>
-          </w:pPr>
-          <w:hyperlink w:anchor="_Toc100004" w:history="1">
-            <w:r>
-              <w:rPr>
-                <w:rStyle w:val="Hyperlink"/>
-              </w:rPr>
-              <w:t>2.3 认证模型（双层，排查问题前必读）</w:t>
-            </w:r>
-            <w:r>
-              <w:tab/>
-            </w:r>
-            <w:r>
-              <w:fldChar w:fldCharType="begin"/>
-            </w:r>
-            <w:r>
-              <w:instrText xml:space="preserve"> PAGEREF _Toc100004 \h </w:instrText>
-            </w:r>
-            <w:r>
-              <w:fldChar w:fldCharType="separate"/>
-            </w:r>
-            <w:r>
-              <w:t>3</w:t>
-            </w:r>
-            <w:r>
-              <w:fldChar w:fldCharType="end"/>
-            </w:r>
-          </w:hyperlink>
-        </w:p>
-        <w:p>
-          <w:pPr>
-            <w:pStyle w:val="11"/>
-            <w:ind w:left="360"/>
-            <w:tabs>
-              <w:tab w:val="right" w:leader="dot" w:pos="9026"/>
-            </w:tabs>
-            <w:spacing w:before="120" w:after="60"/>
-          </w:pPr>
-          <w:hyperlink w:anchor="_Toc100005" w:history="1">
-            <w:r>
-              <w:rPr>
-                <w:rStyle w:val="Hyperlink"/>
-              </w:rPr>
-              <w:t>2.4 角色模型</w:t>
-            </w:r>
-            <w:r>
-              <w:tab/>
-            </w:r>
-            <w:r>
-              <w:fldChar w:fldCharType="begin"/>
-            </w:r>
-            <w:r>
-              <w:instrText xml:space="preserve"> PAGEREF _Toc100005 \h </w:instrText>
-            </w:r>
-            <w:r>
-              <w:fldChar w:fldCharType="separate"/>
-            </w:r>
-            <w:r>
-              <w:t>4</w:t>
-            </w:r>
-            <w:r>
-              <w:fldChar w:fldCharType="end"/>
-            </w:r>
-          </w:hyperlink>
-        </w:p>
-        <w:p>
-          <w:pPr>
-            <w:pStyle w:val="9"/>
-            <w:tabs>
-              <w:tab w:val="right" w:leader="dot" w:pos="9026"/>
-            </w:tabs>
-            <w:spacing w:before="120" w:after="60"/>
-          </w:pPr>
-          <w:hyperlink w:anchor="_Toc100006" w:history="1">
-            <w:r>
-              <w:rPr>
-                <w:rStyle w:val="Hyperlink"/>
-              </w:rPr>
-              <w:t>三、功能清单</w:t>
-            </w:r>
-            <w:r>
-              <w:tab/>
-            </w:r>
-            <w:r>
-              <w:fldChar w:fldCharType="begin"/>
-            </w:r>
-            <w:r>
-              <w:instrText xml:space="preserve"> PAGEREF _Toc100006 \h </w:instrText>
-            </w:r>
-            <w:r>
-              <w:fldChar w:fldCharType="separate"/>
-            </w:r>
-            <w:r>
-              <w:t>4</w:t>
-            </w:r>
-            <w:r>
-              <w:fldChar w:fldCharType="end"/>
-            </w:r>
-          </w:hyperlink>
-        </w:p>
-        <w:p>
-          <w:pPr>
-            <w:pStyle w:val="9"/>
-            <w:tabs>
-              <w:tab w:val="right" w:leader="dot" w:pos="9026"/>
-            </w:tabs>
-            <w:spacing w:before="120" w:after="60"/>
-          </w:pPr>
-          <w:hyperlink w:anchor="_Toc100007" w:history="1">
-            <w:r>
-              <w:rPr>
-                <w:rStyle w:val="Hyperlink"/>
-              </w:rPr>
-              <w:t>四、版本现状（截至 2026-09-06）</w:t>
-            </w:r>
-            <w:r>
-              <w:tab/>
-            </w:r>
-            <w:r>
-              <w:fldChar w:fldCharType="begin"/>
-            </w:r>
-            <w:r>
-              <w:instrText xml:space="preserve"> PAGEREF _Toc100007 \h </w:instrText>
-            </w:r>
-            <w:r>
-              <w:fldChar w:fldCharType="separate"/>
-            </w:r>
-            <w:r>
-              <w:t>4</w:t>
-            </w:r>
-            <w:r>
-              <w:fldChar w:fldCharType="end"/>
-            </w:r>
-          </w:hyperlink>
-        </w:p>
-        <w:p>
-          <w:pPr>
-            <w:pStyle w:val="11"/>
-            <w:ind w:left="360"/>
-            <w:tabs>
-              <w:tab w:val="right" w:leader="dot" w:pos="9026"/>
-            </w:tabs>
-            <w:spacing w:before="120" w:after="60"/>
-          </w:pPr>
-          <w:hyperlink w:anchor="_Toc100008" w:history="1">
-            <w:r>
-              <w:rPr>
-                <w:rStyle w:val="Hyperlink"/>
-              </w:rPr>
-              <w:t>版本演进史一览</w:t>
-            </w:r>
-            <w:r>
-              <w:tab/>
-            </w:r>
-            <w:r>
-              <w:fldChar w:fldCharType="begin"/>
-            </w:r>
-            <w:r>
-              <w:instrText xml:space="preserve"> PAGEREF _Toc100008 \h </w:instrText>
-            </w:r>
-            <w:r>
-              <w:fldChar w:fldCharType="separate"/>
-            </w:r>
-            <w:r>
-              <w:t>5</w:t>
-            </w:r>
-            <w:r>
-              <w:fldChar w:fldCharType="end"/>
-            </w:r>
-          </w:hyperlink>
-        </w:p>
-        <w:p>
-          <w:pPr>
-            <w:pStyle w:val="9"/>
-            <w:tabs>
-              <w:tab w:val="right" w:leader="dot" w:pos="9026"/>
-            </w:tabs>
-            <w:spacing w:before="120" w:after="60"/>
-          </w:pPr>
-          <w:hyperlink w:anchor="_Toc100009" w:history="1">
-            <w:r>
-              <w:rPr>
-                <w:rStyle w:val="Hyperlink"/>
-              </w:rPr>
-              <w:t>五、与"纯后端 ABAP Tcode 对话框"的差异（重点）</w:t>
-            </w:r>
-            <w:r>
-              <w:tab/>
-            </w:r>
-            <w:r>
-              <w:fldChar w:fldCharType="begin"/>
-            </w:r>
-            <w:r>
-              <w:instrText xml:space="preserve"> PAGEREF _Toc100009 \h </w:instrText>
-            </w:r>
-            <w:r>
-              <w:fldChar w:fldCharType="separate"/>
-            </w:r>
-            <w:r>
-              <w:t>5</w:t>
-            </w:r>
-            <w:r>
-              <w:fldChar w:fldCharType="end"/>
-            </w:r>
-          </w:hyperlink>
-        </w:p>
-        <w:p>
-          <w:pPr>
-            <w:pStyle w:val="11"/>
-            <w:ind w:left="360"/>
-            <w:tabs>
-              <w:tab w:val="right" w:leader="dot" w:pos="9026"/>
-            </w:tabs>
-            <w:spacing w:before="120" w:after="60"/>
-          </w:pPr>
-          <w:hyperlink w:anchor="_Toc100010" w:history="1">
-            <w:r>
-              <w:rPr>
-                <w:rStyle w:val="Hyperlink"/>
-              </w:rPr>
-              <w:t>5.1 架构对比</w:t>
-            </w:r>
-            <w:r>
-              <w:tab/>
-            </w:r>
-            <w:r>
-              <w:fldChar w:fldCharType="begin"/>
-            </w:r>
-            <w:r>
-              <w:instrText xml:space="preserve"> PAGEREF _Toc100010 \h </w:instrText>
-            </w:r>
-            <w:r>
-              <w:fldChar w:fldCharType="separate"/>
-            </w:r>
-            <w:r>
-              <w:t>5</w:t>
-            </w:r>
-            <w:r>
-              <w:fldChar w:fldCharType="end"/>
-            </w:r>
-          </w:hyperlink>
-        </w:p>
-        <w:p>
-          <w:pPr>
-            <w:pStyle w:val="11"/>
-            <w:ind w:left="360"/>
-            <w:tabs>
-              <w:tab w:val="right" w:leader="dot" w:pos="9026"/>
-            </w:tabs>
-            <w:spacing w:before="120" w:after="60"/>
-          </w:pPr>
-          <w:hyperlink w:anchor="_Toc100011" w:history="1">
-            <w:r>
-              <w:rPr>
-                <w:rStyle w:val="Hyperlink"/>
-              </w:rPr>
-              <w:t>5.2 大模型场景的适配性（核心差异）</w:t>
-            </w:r>
-            <w:r>
-              <w:tab/>
-            </w:r>
-            <w:r>
-              <w:fldChar w:fldCharType="begin"/>
-            </w:r>
-            <w:r>
-              <w:instrText xml:space="preserve"> PAGEREF _Toc100011 \h </w:instrText>
-            </w:r>
-            <w:r>
-              <w:fldChar w:fldCharType="separate"/>
-            </w:r>
-            <w:r>
-              <w:t>5</w:t>
-            </w:r>
-            <w:r>
-              <w:fldChar w:fldCharType="end"/>
-            </w:r>
-          </w:hyperlink>
-        </w:p>
-        <w:p>
-          <w:pPr>
-            <w:pStyle w:val="11"/>
-            <w:ind w:left="360"/>
-            <w:tabs>
-              <w:tab w:val="right" w:leader="dot" w:pos="9026"/>
-            </w:tabs>
-            <w:spacing w:before="120" w:after="60"/>
-          </w:pPr>
-          <w:hyperlink w:anchor="_Toc100012" w:history="1">
-            <w:r>
-              <w:rPr>
-                <w:rStyle w:val="Hyperlink"/>
-              </w:rPr>
-              <w:t>5.3 用户体验对比</w:t>
-            </w:r>
-            <w:r>
-              <w:tab/>
-            </w:r>
-            <w:r>
-              <w:fldChar w:fldCharType="begin"/>
-            </w:r>
-            <w:r>
-              <w:instrText xml:space="preserve"> PAGEREF _Toc100012 \h </w:instrText>
-            </w:r>
-            <w:r>
-              <w:fldChar w:fldCharType="separate"/>
-            </w:r>
-            <w:r>
-              <w:t>7</w:t>
-            </w:r>
-            <w:r>
-              <w:fldChar w:fldCharType="end"/>
-            </w:r>
-          </w:hyperlink>
-        </w:p>
-        <w:p>
-          <w:pPr>
-            <w:pStyle w:val="11"/>
-            <w:ind w:left="360"/>
-            <w:tabs>
-              <w:tab w:val="right" w:leader="dot" w:pos="9026"/>
-            </w:tabs>
-            <w:spacing w:before="120" w:after="60"/>
-          </w:pPr>
-          <w:hyperlink w:anchor="_Toc100013" w:history="1">
-            <w:r>
-              <w:rPr>
-                <w:rStyle w:val="Hyperlink"/>
-              </w:rPr>
-              <w:t>5.4 安全与权限对比</w:t>
-            </w:r>
-            <w:r>
-              <w:tab/>
-            </w:r>
-            <w:r>
-              <w:fldChar w:fldCharType="begin"/>
-            </w:r>
-            <w:r>
-              <w:instrText xml:space="preserve"> PAGEREF _Toc100013 \h </w:instrText>
-            </w:r>
-            <w:r>
-              <w:fldChar w:fldCharType="separate"/>
-            </w:r>
-            <w:r>
-              <w:t>7</w:t>
-            </w:r>
-            <w:r>
-              <w:fldChar w:fldCharType="end"/>
-            </w:r>
-          </w:hyperlink>
-        </w:p>
-        <w:p>
-          <w:pPr>
-            <w:pStyle w:val="11"/>
-            <w:ind w:left="360"/>
-            <w:tabs>
-              <w:tab w:val="right" w:leader="dot" w:pos="9026"/>
-            </w:tabs>
-            <w:spacing w:before="120" w:after="60"/>
-          </w:pPr>
-          <w:hyperlink w:anchor="_Toc100014" w:history="1">
-            <w:r>
-              <w:rPr>
-                <w:rStyle w:val="Hyperlink"/>
-              </w:rPr>
-              <w:t>5.5 传输与运维对比</w:t>
-            </w:r>
-            <w:r>
-              <w:tab/>
-            </w:r>
-            <w:r>
-              <w:fldChar w:fldCharType="begin"/>
-            </w:r>
-            <w:r>
-              <w:instrText xml:space="preserve"> PAGEREF _Toc100014 \h </w:instrText>
-            </w:r>
-            <w:r>
-              <w:fldChar w:fldCharType="separate"/>
-            </w:r>
-            <w:r>
-              <w:t>7</w:t>
-            </w:r>
-            <w:r>
-              <w:fldChar w:fldCharType="end"/>
-            </w:r>
-          </w:hyperlink>
-        </w:p>
-        <w:p>
-          <w:pPr>
-            <w:pStyle w:val="11"/>
-            <w:ind w:left="360"/>
-            <w:tabs>
-              <w:tab w:val="right" w:leader="dot" w:pos="9026"/>
-            </w:tabs>
-            <w:spacing w:before="120" w:after="60"/>
-          </w:pPr>
-          <w:hyperlink w:anchor="_Toc100015" w:history="1">
-            <w:r>
-              <w:rPr>
-                <w:rStyle w:val="Hyperlink"/>
-              </w:rPr>
-              <w:t>5.6 什么时候仍应选纯 ABAP Tcode</w:t>
-            </w:r>
-            <w:r>
-              <w:tab/>
-            </w:r>
-            <w:r>
-              <w:fldChar w:fldCharType="begin"/>
-            </w:r>
-            <w:r>
-              <w:instrText xml:space="preserve"> PAGEREF _Toc100015 \h </w:instrText>
-            </w:r>
-            <w:r>
-              <w:fldChar w:fldCharType="separate"/>
-            </w:r>
-            <w:r>
-              <w:t>8</w:t>
-            </w:r>
-            <w:r>
-              <w:fldChar w:fldCharType="end"/>
-            </w:r>
-          </w:hyperlink>
-        </w:p>
-        <w:p>
-          <w:pPr>
-            <w:pStyle w:val="9"/>
-            <w:tabs>
-              <w:tab w:val="right" w:leader="dot" w:pos="9026"/>
-            </w:tabs>
-            <w:spacing w:before="120" w:after="60"/>
-          </w:pPr>
-          <w:hyperlink w:anchor="_Toc100016" w:history="1">
-            <w:r>
-              <w:rPr>
-                <w:rStyle w:val="Hyperlink"/>
-              </w:rPr>
-              <w:t>六、文档地图（本套整理版）</w:t>
-            </w:r>
-            <w:r>
-              <w:tab/>
-            </w:r>
-            <w:r>
-              <w:fldChar w:fldCharType="begin"/>
-            </w:r>
-            <w:r>
-              <w:instrText xml:space="preserve"> PAGEREF _Toc100016 \h </w:instrText>
-            </w:r>
-            <w:r>
-              <w:fldChar w:fldCharType="separate"/>
-            </w:r>
-            <w:r>
-              <w:t>9</w:t>
-            </w:r>
-            <w:r>
-              <w:fldChar w:fldCharType="end"/>
-            </w:r>
-          </w:hyperlink>
-        </w:p>
-        <w:p>
-          <w:pPr>
-            <w:pStyle w:val="9"/>
-            <w:tabs>
-              <w:tab w:val="right" w:leader="dot" w:pos="9026"/>
-            </w:tabs>
-            <w:spacing w:before="120" w:after="60"/>
-          </w:pPr>
-          <w:hyperlink w:anchor="_Toc100017" w:history="1">
-            <w:r>
-              <w:rPr>
-                <w:rStyle w:val="Hyperlink"/>
-              </w:rPr>
-              <w:t>七、本地运行速查</w:t>
-            </w:r>
-            <w:r>
-              <w:tab/>
-            </w:r>
-            <w:r>
-              <w:fldChar w:fldCharType="begin"/>
-            </w:r>
-            <w:r>
-              <w:instrText xml:space="preserve"> PAGEREF _Toc100017 \h </w:instrText>
-            </w:r>
-            <w:r>
-              <w:fldChar w:fldCharType="separate"/>
-            </w:r>
-            <w:r>
-              <w:t>9</w:t>
-            </w:r>
-            <w:r>
-              <w:fldChar w:fldCharType="end"/>
-            </w:r>
-          </w:hyperlink>
         </w:p>
         <w:p>
           <w:r>
@@ -1057,7 +413,29 @@
           <w:szCs w:val="22"/>
           <w:rFonts w:ascii="Times New Roman" w:eastAsia="SimSun"/>
         </w:rPr>
-        <w:t xml:space="preserve">更新时间：2026-09-06 ｜ 前端 V8.3（3 补丁）+ 后端 V8.4，全链路已在服务器验证通过</w:t>
+        <w:t xml:space="preserve">更新时间：2026-10-11 ｜ 前端 Agent 场景与模型白名单 + 后端报表 A/B 批；部署前以 </w:t>
+      </w:r>
+      <w:r>
+        <w:rPr>
+          <w:b w:val="false"/>
+          <w:bCs w:val="false"/>
+          <w:color w:val="9C2B4B"/>
+          <w:sz w:val="22"/>
+          <w:szCs w:val="22"/>
+          <w:rFonts w:ascii="Consolas" w:eastAsia="Microsoft YaHei"/>
+        </w:rPr>
+        <w:t xml:space="preserve">backend-abap/00_对象清单与部署顺序_20261011.md</w:t>
+      </w:r>
+      <w:r>
+        <w:rPr>
+          <w:b w:val="false"/>
+          <w:bCs w:val="false"/>
+          <w:color w:val="5A6472"/>
+          <w:sz w:val="22"/>
+          <w:szCs w:val="22"/>
+          <w:rFonts w:ascii="Times New Roman" w:eastAsia="SimSun"/>
+        </w:rPr>
+        <w:t xml:space="preserve"> 为准</w:t>
       </w:r>
     </w:p>
     <w:p>
@@ -1065,7 +443,6 @@
         <w:pStyle w:val="Heading1"/>
         <w:spacing w:before="360" w:after="160" w:line="312"/>
       </w:pPr>
-      <w:bookmarkStart w:id="100000" w:name="_Toc100000"/>
       <w:r>
         <w:rPr>
           <w:b/>
@@ -1077,7 +454,6 @@
         </w:rPr>
         <w:t xml:space="preserve">一、这是什么</w:t>
       </w:r>
-      <w:bookmarkEnd w:id="100000"/>
     </w:p>
     <w:p>
       <w:pPr>
@@ -1138,73 +514,7 @@
           <w:szCs w:val="22"/>
           <w:rFonts w:ascii="Times New Roman" w:eastAsia="SimSun"/>
         </w:rPr>
-        <w:t xml:space="preserve">：提问里带上程序名/事务代码（如 </w:t>
-      </w:r>
-      <w:r>
-        <w:rPr>
-          <w:b w:val="false"/>
-          <w:bCs w:val="false"/>
-          <w:color w:val="9C2B4B"/>
-          <w:sz w:val="22"/>
-          <w:szCs w:val="22"/>
-          <w:rFonts w:ascii="Consolas" w:eastAsia="Microsoft YaHei"/>
-        </w:rPr>
-        <w:t xml:space="preserve">ZAPP0018</w:t>
-      </w:r>
-      <w:r>
-        <w:rPr>
-          <w:b w:val="false"/>
-          <w:bCs w:val="false"/>
-          <w:color w:val="1A1A1A"/>
-          <w:sz w:val="22"/>
-          <w:szCs w:val="22"/>
-          <w:rFonts w:ascii="Times New Roman" w:eastAsia="SimSun"/>
-        </w:rPr>
-        <w:t xml:space="preserve">、</w:t>
-      </w:r>
-      <w:r>
-        <w:rPr>
-          <w:b w:val="false"/>
-          <w:bCs w:val="false"/>
-          <w:color w:val="9C2B4B"/>
-          <w:sz w:val="22"/>
-          <w:szCs w:val="22"/>
-          <w:rFonts w:ascii="Consolas" w:eastAsia="Microsoft YaHei"/>
-        </w:rPr>
-        <w:t xml:space="preserve">分析 表 MARC 的数据</w:t>
-      </w:r>
-      <w:r>
-        <w:rPr>
-          <w:b w:val="false"/>
-          <w:bCs w:val="false"/>
-          <w:color w:val="1A1A1A"/>
-          <w:sz w:val="22"/>
-          <w:szCs w:val="22"/>
-          <w:rFonts w:ascii="Times New Roman" w:eastAsia="SimSun"/>
-        </w:rPr>
-        <w:t xml:space="preserve">），后端自动提取</w:t>
-      </w:r>
-      <w:r>
-        <w:rPr>
-          <w:b/>
-          <w:bCs/>
-          <w:color w:val="1A1A1A"/>
-          <w:sz w:val="22"/>
-          <w:szCs w:val="22"/>
-          <w:rFonts w:ascii="Times New Roman" w:eastAsia="SimSun"/>
-        </w:rPr>
-        <w:t xml:space="preserve">源码 / 表结构 / 表数据样例</w:t>
-      </w:r>
-      <w:r>
-        <w:rPr>
-          <w:b w:val="false"/>
-          <w:bCs w:val="false"/>
-          <w:color w:val="1A1A1A"/>
-          <w:sz w:val="22"/>
-          <w:szCs w:val="22"/>
-          <w:rFonts w:ascii="Times New Roman" w:eastAsia="SimSun"/>
-        </w:rPr>
-        <w:t xml:space="preserve">喂给大模型，回答贴合你系统里的真实代码与数据；</w:t>
+        <w:t xml:space="preserve">：普通对话默认不读取 SAP 对象；需要读源码、表结构或表数据时进入 Agent 的“代码分析”或“数据分析”场景，由后端白名单工具读取并把事实喂给大模型；</w:t>
       </w:r>
     </w:p>
     <w:p>
@@ -1319,7 +629,6 @@
         <w:pageBreakBefore/>
         <w:spacing w:before="360" w:after="160" w:line="312"/>
       </w:pPr>
-      <w:bookmarkStart w:id="100001" w:name="_Toc100001"/>
       <w:r>
         <w:rPr>
           <w:b/>
@@ -1331,14 +640,12 @@
         </w:rPr>
         <w:t xml:space="preserve">二、系统全景</w:t>
       </w:r>
-      <w:bookmarkEnd w:id="100001"/>
     </w:p>
     <w:p>
       <w:pPr>
         <w:pStyle w:val="Heading2"/>
         <w:spacing w:before="240" w:after="120" w:line="312"/>
       </w:pPr>
-      <w:bookmarkStart w:id="100002" w:name="_Toc100002"/>
       <w:r>
         <w:rPr>
           <w:b/>
@@ -1350,7 +657,6 @@
         </w:rPr>
         <w:t xml:space="preserve">2.1 架构图</w:t>
       </w:r>
-      <w:bookmarkEnd w:id="100002"/>
     </w:p>
     <w:tbl>
       <w:tblPr>
@@ -1474,7 +780,7 @@
                 <w:szCs w:val="17"/>
                 <w:rFonts w:ascii="Consolas" w:eastAsia="Microsoft YaHei"/>
               </w:rPr>
-              <w:t xml:space="preserve">        ├─ ZCL_ZAI_CHAT_DPC_EXT    网关数据提供类（12 个 Function Import 分发）</w:t>
+              <w:t xml:space="preserve">        ├─ ZCL_ZAI_CHAT_DPC_EXT    网关数据提供类（22 个 Function Import 分发，AnalyzeTask 支持 Scene）</w:t>
             </w:r>
           </w:p>
           <w:p>
@@ -1560,7 +866,6 @@
         <w:pStyle w:val="Heading2"/>
         <w:spacing w:before="240" w:after="120" w:line="312"/>
       </w:pPr>
-      <w:bookmarkStart w:id="100003" w:name="_Toc100003"/>
       <w:r>
         <w:rPr>
           <w:b/>
@@ -1572,7 +877,6 @@
         </w:rPr>
         <w:t xml:space="preserve">2.2 关键地址与账号（当前环境实测值）</w:t>
       </w:r>
-      <w:bookmarkEnd w:id="100003"/>
     </w:p>
     <w:tbl>
       <w:tblPr>
@@ -2003,7 +1307,6 @@
         <w:pStyle w:val="Heading2"/>
         <w:spacing w:before="240" w:after="120" w:line="312"/>
       </w:pPr>
-      <w:bookmarkStart w:id="100004" w:name="_Toc100004"/>
       <w:r>
         <w:rPr>
           <w:b/>
@@ -2015,7 +1318,6 @@
         </w:rPr>
         <w:t xml:space="preserve">2.3 认证模型（双层，排查问题前必读）</w:t>
       </w:r>
-      <w:bookmarkEnd w:id="100004"/>
     </w:p>
     <w:p>
       <w:pPr>
@@ -2238,7 +1540,6 @@
         <w:pStyle w:val="Heading2"/>
         <w:spacing w:before="240" w:after="120" w:line="312"/>
       </w:pPr>
-      <w:bookmarkStart w:id="100005" w:name="_Toc100005"/>
       <w:r>
         <w:rPr>
           <w:b/>
@@ -2250,7 +1551,6 @@
         </w:rPr>
         <w:t xml:space="preserve">2.4 角色模型</w:t>
       </w:r>
-      <w:bookmarkEnd w:id="100005"/>
     </w:p>
     <w:tbl>
       <w:tblPr>
@@ -2506,7 +1806,6 @@
         <w:pageBreakBefore/>
         <w:spacing w:before="360" w:after="160" w:line="312"/>
       </w:pPr>
-      <w:bookmarkStart w:id="100006" w:name="_Toc100006"/>
       <w:r>
         <w:rPr>
           <w:b/>
@@ -2518,7 +1817,6 @@
         </w:rPr>
         <w:t xml:space="preserve">三、功能清单</w:t>
       </w:r>
-      <w:bookmarkEnd w:id="100006"/>
     </w:p>
     <w:tbl>
       <w:tblPr>
@@ -3426,7 +2724,6 @@
         <w:pageBreakBefore/>
         <w:spacing w:before="360" w:after="160" w:line="312"/>
       </w:pPr>
-      <w:bookmarkStart w:id="100007" w:name="_Toc100007"/>
       <w:r>
         <w:rPr>
           <w:b/>
@@ -3436,9 +2733,8 @@
           <w:szCs w:val="32"/>
           <w:rFonts w:ascii="Arial" w:eastAsia="SimHei"/>
         </w:rPr>
-        <w:t xml:space="preserve">四、版本现状（截至 2026-09-06）</w:t>
-      </w:r>
-      <w:bookmarkEnd w:id="100007"/>
+        <w:t xml:space="preserve">三-A、2026-10-11 用户能感知到的变化</w:t>
+      </w:r>
     </w:p>
     <w:p>
       <w:pPr>
@@ -3449,25 +2745,1683 @@
       </w:pPr>
       <w:r>
         <w:rPr>
+          <w:b w:val="false"/>
+          <w:bCs w:val="false"/>
+          <w:color w:val="1A1A1A"/>
+          <w:sz w:val="24"/>
+          <w:szCs w:val="24"/>
+          <w:rFonts w:ascii="Times New Roman" w:eastAsia="SimSun"/>
+          <w:highlight w:val="yellow"/>
+          <w:highlightCs w:val="yellow"/>
+        </w:rPr>
+        <w:t xml:space="preserve">这部分是本次更新的使用口径。部署动作、对象版本和激活顺序以 03-后端实施文档 的“〇-A 当前批次”为准。</w:t>
+      </w:r>
+    </w:p>
+    <w:tbl>
+      <w:tblPr>
+        <w:tblW w:type="pct" w:w="100%"/>
+        <w:tblBorders>
+          <w:top w:val="single" w:color="1B6B7A" w:sz="8"/>
+          <w:left w:val="none" w:color="auto" w:sz="0"/>
+          <w:bottom w:val="single" w:color="1B6B7A" w:sz="8"/>
+          <w:right w:val="none" w:color="auto" w:sz="0"/>
+          <w:insideH w:val="single" w:color="C8DDE2" w:sz="2"/>
+          <w:insideV w:val="none" w:color="auto" w:sz="0"/>
+        </w:tblBorders>
+      </w:tblPr>
+      <w:tblGrid>
+        <w:gridCol w:w="100"/>
+        <w:gridCol w:w="100"/>
+        <w:gridCol w:w="100"/>
+        <w:gridCol w:w="100"/>
+      </w:tblGrid>
+      <w:tr>
+        <w:trPr>
+          <w:cantSplit/>
+          <w:tblHeader/>
+        </w:trPr>
+        <w:tc>
+          <w:tcPr>
+            <w:tcW w:type="pct" w:w="25%"/>
+            <w:shd w:fill="1B6B7A" w:val="clear"/>
+            <w:tcMar>
+              <w:top w:type="dxa" w:w="60"/>
+              <w:left w:type="dxa" w:w="120"/>
+              <w:bottom w:type="dxa" w:w="60"/>
+              <w:right w:type="dxa" w:w="120"/>
+            </w:tcMar>
+          </w:tcPr>
+          <w:p>
+            <w:pPr>
+              <w:spacing w:line="276"/>
+              <w:jc w:val="center"/>
+            </w:pPr>
+            <w:r>
+              <w:rPr>
+                <w:b/>
+                <w:bCs/>
+                <w:color w:val="FFFFFF"/>
+                <w:sz w:val="20"/>
+                <w:szCs w:val="20"/>
+                <w:rFonts w:ascii="Arial" w:eastAsia="SimHei"/>
+              </w:rPr>
+              <w:t xml:space="preserve">场景</w:t>
+            </w:r>
+          </w:p>
+        </w:tc>
+        <w:tc>
+          <w:tcPr>
+            <w:tcW w:type="pct" w:w="25%"/>
+            <w:shd w:fill="1B6B7A" w:val="clear"/>
+            <w:tcMar>
+              <w:top w:type="dxa" w:w="60"/>
+              <w:left w:type="dxa" w:w="120"/>
+              <w:bottom w:type="dxa" w:w="60"/>
+              <w:right w:type="dxa" w:w="120"/>
+            </w:tcMar>
+          </w:tcPr>
+          <w:p>
+            <w:pPr>
+              <w:spacing w:line="276"/>
+              <w:jc w:val="center"/>
+            </w:pPr>
+            <w:r>
+              <w:rPr>
+                <w:b/>
+                <w:bCs/>
+                <w:color w:val="FFFFFF"/>
+                <w:sz w:val="20"/>
+                <w:szCs w:val="20"/>
+                <w:rFonts w:ascii="Arial" w:eastAsia="SimHei"/>
+              </w:rPr>
+              <w:t xml:space="preserve">用户入口</w:t>
+            </w:r>
+          </w:p>
+        </w:tc>
+        <w:tc>
+          <w:tcPr>
+            <w:tcW w:type="pct" w:w="25%"/>
+            <w:shd w:fill="1B6B7A" w:val="clear"/>
+            <w:tcMar>
+              <w:top w:type="dxa" w:w="60"/>
+              <w:left w:type="dxa" w:w="120"/>
+              <w:bottom w:type="dxa" w:w="60"/>
+              <w:right w:type="dxa" w:w="120"/>
+            </w:tcMar>
+          </w:tcPr>
+          <w:p>
+            <w:pPr>
+              <w:spacing w:line="276"/>
+              <w:jc w:val="center"/>
+            </w:pPr>
+            <w:r>
+              <w:rPr>
+                <w:b/>
+                <w:bCs/>
+                <w:color w:val="FFFFFF"/>
+                <w:sz w:val="20"/>
+                <w:szCs w:val="20"/>
+                <w:rFonts w:ascii="Arial" w:eastAsia="SimHei"/>
+              </w:rPr>
+              <w:t xml:space="preserve">后端行为</w:t>
+            </w:r>
+          </w:p>
+        </w:tc>
+        <w:tc>
+          <w:tcPr>
+            <w:tcW w:type="pct" w:w="25%"/>
+            <w:shd w:fill="1B6B7A" w:val="clear"/>
+            <w:tcMar>
+              <w:top w:type="dxa" w:w="60"/>
+              <w:left w:type="dxa" w:w="120"/>
+              <w:bottom w:type="dxa" w:w="60"/>
+              <w:right w:type="dxa" w:w="120"/>
+            </w:tcMar>
+          </w:tcPr>
+          <w:p>
+            <w:pPr>
+              <w:spacing w:line="276"/>
+              <w:jc w:val="center"/>
+            </w:pPr>
+            <w:r>
+              <w:rPr>
+                <w:b/>
+                <w:bCs/>
+                <w:color w:val="FFFFFF"/>
+                <w:sz w:val="20"/>
+                <w:szCs w:val="20"/>
+                <w:rFonts w:ascii="Arial" w:eastAsia="SimHei"/>
+              </w:rPr>
+              <w:t xml:space="preserve">明确边界</w:t>
+            </w:r>
+          </w:p>
+        </w:tc>
+      </w:tr>
+      <w:tr>
+        <w:trPr>
+          <w:cantSplit/>
+        </w:trPr>
+        <w:tc>
+          <w:tcPr>
+            <w:tcW w:type="pct" w:w="25%"/>
+            <w:tcMar>
+              <w:top w:type="dxa" w:w="60"/>
+              <w:left w:type="dxa" w:w="120"/>
+              <w:bottom w:type="dxa" w:w="60"/>
+              <w:right w:type="dxa" w:w="120"/>
+            </w:tcMar>
+          </w:tcPr>
+          <w:p>
+            <w:pPr>
+              <w:spacing w:line="276"/>
+              <w:jc w:val="left"/>
+            </w:pPr>
+            <w:r>
+              <w:rPr>
+                <w:b w:val="false"/>
+                <w:bCs w:val="false"/>
+                <w:color w:val="1A1A1A"/>
+                <w:sz w:val="20"/>
+                <w:szCs w:val="20"/>
+                <w:rFonts w:ascii="Times New Roman" w:eastAsia="SimSun"/>
+              </w:rPr>
+              <w:t xml:space="preserve">报表执行</w:t>
+            </w:r>
+          </w:p>
+        </w:tc>
+        <w:tc>
+          <w:tcPr>
+            <w:tcW w:type="pct" w:w="25%"/>
+            <w:tcMar>
+              <w:top w:type="dxa" w:w="60"/>
+              <w:left w:type="dxa" w:w="120"/>
+              <w:bottom w:type="dxa" w:w="60"/>
+              <w:right w:type="dxa" w:w="120"/>
+            </w:tcMar>
+          </w:tcPr>
+          <w:p>
+            <w:pPr>
+              <w:spacing w:line="276"/>
+              <w:jc w:val="left"/>
+            </w:pPr>
+            <w:r>
+              <w:rPr>
+                <w:b w:val="false"/>
+                <w:bCs w:val="false"/>
+                <w:color w:val="1A1A1A"/>
+                <w:sz w:val="20"/>
+                <w:szCs w:val="20"/>
+                <w:rFonts w:ascii="Times New Roman" w:eastAsia="SimSun"/>
+              </w:rPr>
+              <w:t xml:space="preserve">Agent → 报表执行</w:t>
+            </w:r>
+          </w:p>
+        </w:tc>
+        <w:tc>
+          <w:tcPr>
+            <w:tcW w:type="pct" w:w="25%"/>
+            <w:tcMar>
+              <w:top w:type="dxa" w:w="60"/>
+              <w:left w:type="dxa" w:w="120"/>
+              <w:bottom w:type="dxa" w:w="60"/>
+              <w:right w:type="dxa" w:w="120"/>
+            </w:tcMar>
+          </w:tcPr>
+          <w:p>
+            <w:pPr>
+              <w:spacing w:line="276"/>
+              <w:jc w:val="left"/>
+            </w:pPr>
+            <w:r>
+              <w:rPr>
+                <w:b w:val="false"/>
+                <w:bCs w:val="false"/>
+                <w:color w:val="1A1A1A"/>
+                <w:sz w:val="20"/>
+                <w:szCs w:val="20"/>
+                <w:rFonts w:ascii="Times New Roman" w:eastAsia="SimSun"/>
+              </w:rPr>
+              <w:t xml:space="preserve">识别登记的 TCode，展示参数，提交真实后台作业；作业结果 READY 后可直接追问</w:t>
+            </w:r>
+          </w:p>
+        </w:tc>
+        <w:tc>
+          <w:tcPr>
+            <w:tcW w:type="pct" w:w="25%"/>
+            <w:tcMar>
+              <w:top w:type="dxa" w:w="60"/>
+              <w:left w:type="dxa" w:w="120"/>
+              <w:bottom w:type="dxa" w:w="60"/>
+              <w:right w:type="dxa" w:w="120"/>
+            </w:tcMar>
+          </w:tcPr>
+          <w:p>
+            <w:pPr>
+              <w:spacing w:line="276"/>
+              <w:jc w:val="left"/>
+            </w:pPr>
+            <w:r>
+              <w:rPr>
+                <w:b w:val="false"/>
+                <w:bCs w:val="false"/>
+                <w:color w:val="1A1A1A"/>
+                <w:sz w:val="20"/>
+                <w:szCs w:val="20"/>
+                <w:rFonts w:ascii="Times New Roman" w:eastAsia="SimSun"/>
+              </w:rPr>
+              <w:t xml:space="preserve">不在报表场景执行任意表分析；无登记报表时列出可执行报表</w:t>
+            </w:r>
+          </w:p>
+        </w:tc>
+      </w:tr>
+      <w:tr>
+        <w:trPr>
+          <w:cantSplit/>
+        </w:trPr>
+        <w:tc>
+          <w:tcPr>
+            <w:tcW w:type="pct" w:w="25%"/>
+            <w:tcMar>
+              <w:top w:type="dxa" w:w="60"/>
+              <w:left w:type="dxa" w:w="120"/>
+              <w:bottom w:type="dxa" w:w="60"/>
+              <w:right w:type="dxa" w:w="120"/>
+            </w:tcMar>
+          </w:tcPr>
+          <w:p>
+            <w:pPr>
+              <w:spacing w:line="276"/>
+              <w:jc w:val="left"/>
+            </w:pPr>
+            <w:r>
+              <w:rPr>
+                <w:b w:val="false"/>
+                <w:bCs w:val="false"/>
+                <w:color w:val="1A1A1A"/>
+                <w:sz w:val="20"/>
+                <w:szCs w:val="20"/>
+                <w:rFonts w:ascii="Times New Roman" w:eastAsia="SimSun"/>
+              </w:rPr>
+              <w:t xml:space="preserve">数据分析</w:t>
+            </w:r>
+          </w:p>
+        </w:tc>
+        <w:tc>
+          <w:tcPr>
+            <w:tcW w:type="pct" w:w="25%"/>
+            <w:tcMar>
+              <w:top w:type="dxa" w:w="60"/>
+              <w:left w:type="dxa" w:w="120"/>
+              <w:bottom w:type="dxa" w:w="60"/>
+              <w:right w:type="dxa" w:w="120"/>
+            </w:tcMar>
+          </w:tcPr>
+          <w:p>
+            <w:pPr>
+              <w:spacing w:line="276"/>
+              <w:jc w:val="left"/>
+            </w:pPr>
+            <w:r>
+              <w:rPr>
+                <w:b w:val="false"/>
+                <w:bCs w:val="false"/>
+                <w:color w:val="1A1A1A"/>
+                <w:sz w:val="20"/>
+                <w:szCs w:val="20"/>
+                <w:rFonts w:ascii="Times New Roman" w:eastAsia="SimSun"/>
+              </w:rPr>
+              <w:t xml:space="preserve">Agent → 数据分析</w:t>
+            </w:r>
+          </w:p>
+        </w:tc>
+        <w:tc>
+          <w:tcPr>
+            <w:tcW w:type="pct" w:w="25%"/>
+            <w:tcMar>
+              <w:top w:type="dxa" w:w="60"/>
+              <w:left w:type="dxa" w:w="120"/>
+              <w:bottom w:type="dxa" w:w="60"/>
+              <w:right w:type="dxa" w:w="120"/>
+            </w:tcMar>
+          </w:tcPr>
+          <w:p>
+            <w:pPr>
+              <w:spacing w:line="276"/>
+              <w:jc w:val="left"/>
+            </w:pPr>
+            <w:r>
+              <w:rPr>
+                <w:b w:val="false"/>
+                <w:bCs w:val="false"/>
+                <w:color w:val="1A1A1A"/>
+                <w:sz w:val="20"/>
+                <w:szCs w:val="20"/>
+                <w:rFonts w:ascii="Times New Roman" w:eastAsia="SimSun"/>
+              </w:rPr>
+              <w:t xml:space="preserve">按登记能力和工具执行只读表分析；表名在前或“表名 + 表”都能识别</w:t>
+            </w:r>
+          </w:p>
+        </w:tc>
+        <w:tc>
+          <w:tcPr>
+            <w:tcW w:type="pct" w:w="25%"/>
+            <w:tcMar>
+              <w:top w:type="dxa" w:w="60"/>
+              <w:left w:type="dxa" w:w="120"/>
+              <w:bottom w:type="dxa" w:w="60"/>
+              <w:right w:type="dxa" w:w="120"/>
+            </w:tcMar>
+          </w:tcPr>
+          <w:p>
+            <w:pPr>
+              <w:spacing w:line="276"/>
+              <w:jc w:val="left"/>
+            </w:pPr>
+            <w:r>
+              <w:rPr>
+                <w:b w:val="false"/>
+                <w:bCs w:val="false"/>
+                <w:color w:val="1A1A1A"/>
+                <w:sz w:val="20"/>
+                <w:szCs w:val="20"/>
+                <w:rFonts w:ascii="Times New Roman" w:eastAsia="SimSun"/>
+              </w:rPr>
+              <w:t xml:space="preserve">不触发报表作业；不生成任意 SQL/OData</w:t>
+            </w:r>
+          </w:p>
+        </w:tc>
+      </w:tr>
+      <w:tr>
+        <w:trPr>
+          <w:cantSplit/>
+        </w:trPr>
+        <w:tc>
+          <w:tcPr>
+            <w:tcW w:type="pct" w:w="25%"/>
+            <w:tcMar>
+              <w:top w:type="dxa" w:w="60"/>
+              <w:left w:type="dxa" w:w="120"/>
+              <w:bottom w:type="dxa" w:w="60"/>
+              <w:right w:type="dxa" w:w="120"/>
+            </w:tcMar>
+          </w:tcPr>
+          <w:p>
+            <w:pPr>
+              <w:spacing w:line="276"/>
+              <w:jc w:val="left"/>
+            </w:pPr>
+            <w:r>
+              <w:rPr>
+                <w:b w:val="false"/>
+                <w:bCs w:val="false"/>
+                <w:color w:val="1A1A1A"/>
+                <w:sz w:val="20"/>
+                <w:szCs w:val="20"/>
+                <w:rFonts w:ascii="Times New Roman" w:eastAsia="SimSun"/>
+              </w:rPr>
+              <w:t xml:space="preserve">库存查询</w:t>
+            </w:r>
+          </w:p>
+        </w:tc>
+        <w:tc>
+          <w:tcPr>
+            <w:tcW w:type="pct" w:w="25%"/>
+            <w:tcMar>
+              <w:top w:type="dxa" w:w="60"/>
+              <w:left w:type="dxa" w:w="120"/>
+              <w:bottom w:type="dxa" w:w="60"/>
+              <w:right w:type="dxa" w:w="120"/>
+            </w:tcMar>
+          </w:tcPr>
+          <w:p>
+            <w:pPr>
+              <w:spacing w:line="276"/>
+              <w:jc w:val="left"/>
+            </w:pPr>
+            <w:r>
+              <w:rPr>
+                <w:b w:val="false"/>
+                <w:bCs w:val="false"/>
+                <w:color w:val="1A1A1A"/>
+                <w:sz w:val="20"/>
+                <w:szCs w:val="20"/>
+                <w:rFonts w:ascii="Times New Roman" w:eastAsia="SimSun"/>
+              </w:rPr>
+              <w:t xml:space="preserve">Agent → 库存查询</w:t>
+            </w:r>
+          </w:p>
+        </w:tc>
+        <w:tc>
+          <w:tcPr>
+            <w:tcW w:type="pct" w:w="25%"/>
+            <w:tcMar>
+              <w:top w:type="dxa" w:w="60"/>
+              <w:left w:type="dxa" w:w="120"/>
+              <w:bottom w:type="dxa" w:w="60"/>
+              <w:right w:type="dxa" w:w="120"/>
+            </w:tcMar>
+          </w:tcPr>
+          <w:p>
+            <w:pPr>
+              <w:spacing w:line="276"/>
+              <w:jc w:val="left"/>
+            </w:pPr>
+            <w:r>
+              <w:rPr>
+                <w:b w:val="false"/>
+                <w:bCs w:val="false"/>
+                <w:color w:val="1A1A1A"/>
+                <w:sz w:val="20"/>
+                <w:szCs w:val="20"/>
+                <w:rFonts w:ascii="Times New Roman" w:eastAsia="SimSun"/>
+              </w:rPr>
+              <w:t xml:space="preserve">只调用库存候选、库存快照、收发和批次库存只读工具</w:t>
+            </w:r>
+          </w:p>
+        </w:tc>
+        <w:tc>
+          <w:tcPr>
+            <w:tcW w:type="pct" w:w="25%"/>
+            <w:tcMar>
+              <w:top w:type="dxa" w:w="60"/>
+              <w:left w:type="dxa" w:w="120"/>
+              <w:bottom w:type="dxa" w:w="60"/>
+              <w:right w:type="dxa" w:w="120"/>
+            </w:tcMar>
+          </w:tcPr>
+          <w:p>
+            <w:pPr>
+              <w:spacing w:line="276"/>
+              <w:jc w:val="left"/>
+            </w:pPr>
+            <w:r>
+              <w:rPr>
+                <w:b w:val="false"/>
+                <w:bCs w:val="false"/>
+                <w:color w:val="1A1A1A"/>
+                <w:sz w:val="20"/>
+                <w:szCs w:val="20"/>
+                <w:rFonts w:ascii="Times New Roman" w:eastAsia="SimSun"/>
+              </w:rPr>
+              <w:t xml:space="preserve">表分析和报表执行提示换场景</w:t>
+            </w:r>
+          </w:p>
+        </w:tc>
+      </w:tr>
+      <w:tr>
+        <w:trPr>
+          <w:cantSplit/>
+        </w:trPr>
+        <w:tc>
+          <w:tcPr>
+            <w:tcW w:type="pct" w:w="25%"/>
+            <w:tcMar>
+              <w:top w:type="dxa" w:w="60"/>
+              <w:left w:type="dxa" w:w="120"/>
+              <w:bottom w:type="dxa" w:w="60"/>
+              <w:right w:type="dxa" w:w="120"/>
+            </w:tcMar>
+          </w:tcPr>
+          <w:p>
+            <w:pPr>
+              <w:spacing w:line="276"/>
+              <w:jc w:val="left"/>
+            </w:pPr>
+            <w:r>
+              <w:rPr>
+                <w:b w:val="false"/>
+                <w:bCs w:val="false"/>
+                <w:color w:val="1A1A1A"/>
+                <w:sz w:val="20"/>
+                <w:szCs w:val="20"/>
+                <w:rFonts w:ascii="Times New Roman" w:eastAsia="SimSun"/>
+              </w:rPr>
+              <w:t xml:space="preserve">代码分析</w:t>
+            </w:r>
+          </w:p>
+        </w:tc>
+        <w:tc>
+          <w:tcPr>
+            <w:tcW w:type="pct" w:w="25%"/>
+            <w:tcMar>
+              <w:top w:type="dxa" w:w="60"/>
+              <w:left w:type="dxa" w:w="120"/>
+              <w:bottom w:type="dxa" w:w="60"/>
+              <w:right w:type="dxa" w:w="120"/>
+            </w:tcMar>
+          </w:tcPr>
+          <w:p>
+            <w:pPr>
+              <w:spacing w:line="276"/>
+              <w:jc w:val="left"/>
+            </w:pPr>
+            <w:r>
+              <w:rPr>
+                <w:b w:val="false"/>
+                <w:bCs w:val="false"/>
+                <w:color w:val="1A1A1A"/>
+                <w:sz w:val="20"/>
+                <w:szCs w:val="20"/>
+                <w:rFonts w:ascii="Times New Roman" w:eastAsia="SimSun"/>
+              </w:rPr>
+              <w:t xml:space="preserve">Agent → 代码分析</w:t>
+            </w:r>
+          </w:p>
+        </w:tc>
+        <w:tc>
+          <w:tcPr>
+            <w:tcW w:type="pct" w:w="25%"/>
+            <w:tcMar>
+              <w:top w:type="dxa" w:w="60"/>
+              <w:left w:type="dxa" w:w="120"/>
+              <w:bottom w:type="dxa" w:w="60"/>
+              <w:right w:type="dxa" w:w="120"/>
+            </w:tcMar>
+          </w:tcPr>
+          <w:p>
+            <w:pPr>
+              <w:spacing w:line="276"/>
+              <w:jc w:val="left"/>
+            </w:pPr>
+            <w:r>
+              <w:rPr>
+                <w:b w:val="false"/>
+                <w:bCs w:val="false"/>
+                <w:color w:val="9C2B4B"/>
+                <w:sz w:val="20"/>
+                <w:szCs w:val="20"/>
+                <w:rFonts w:ascii="Consolas" w:eastAsia="Microsoft YaHei"/>
+              </w:rPr>
+              <w:t xml:space="preserve">read_program_source</w:t>
+            </w:r>
+            <w:r>
+              <w:rPr>
+                <w:b w:val="false"/>
+                <w:bCs w:val="false"/>
+                <w:color w:val="1A1A1A"/>
+                <w:sz w:val="20"/>
+                <w:szCs w:val="20"/>
+                <w:rFonts w:ascii="Times New Roman" w:eastAsia="SimSun"/>
+              </w:rPr>
+              <w:t xml:space="preserve"> 分页读取 Z/Y/命名空间源码或 TCode 主程序，也可读表结构</w:t>
+            </w:r>
+          </w:p>
+        </w:tc>
+        <w:tc>
+          <w:tcPr>
+            <w:tcW w:type="pct" w:w="25%"/>
+            <w:tcMar>
+              <w:top w:type="dxa" w:w="60"/>
+              <w:left w:type="dxa" w:w="120"/>
+              <w:bottom w:type="dxa" w:w="60"/>
+              <w:right w:type="dxa" w:w="120"/>
+            </w:tcMar>
+          </w:tcPr>
+          <w:p>
+            <w:pPr>
+              <w:spacing w:line="276"/>
+              <w:jc w:val="left"/>
+            </w:pPr>
+            <w:r>
+              <w:rPr>
+                <w:b w:val="false"/>
+                <w:bCs w:val="false"/>
+                <w:color w:val="1A1A1A"/>
+                <w:sz w:val="20"/>
+                <w:szCs w:val="20"/>
+                <w:rFonts w:ascii="Times New Roman" w:eastAsia="SimSun"/>
+              </w:rPr>
+              <w:t xml:space="preserve">受 </w:t>
+            </w:r>
+            <w:r>
+              <w:rPr>
+                <w:b w:val="false"/>
+                <w:bCs w:val="false"/>
+                <w:color w:val="9C2B4B"/>
+                <w:sz w:val="20"/>
+                <w:szCs w:val="20"/>
+                <w:rFonts w:ascii="Consolas" w:eastAsia="Microsoft YaHei"/>
+              </w:rPr>
+              <w:t xml:space="preserve">USER_HIDE_SRC</w:t>
+            </w:r>
+            <w:r>
+              <w:rPr>
+                <w:b w:val="false"/>
+                <w:bCs w:val="false"/>
+                <w:color w:val="1A1A1A"/>
+                <w:sz w:val="20"/>
+                <w:szCs w:val="20"/>
+                <w:rFonts w:ascii="Times New Roman" w:eastAsia="SimSun"/>
+              </w:rPr>
+              <w:t xml:space="preserve"> 和对象白名单限制；不执行代码</w:t>
+            </w:r>
+          </w:p>
+        </w:tc>
+      </w:tr>
+      <w:tr>
+        <w:trPr>
+          <w:cantSplit/>
+        </w:trPr>
+        <w:tc>
+          <w:tcPr>
+            <w:tcW w:type="pct" w:w="25%"/>
+            <w:tcMar>
+              <w:top w:type="dxa" w:w="60"/>
+              <w:left w:type="dxa" w:w="120"/>
+              <w:bottom w:type="dxa" w:w="60"/>
+              <w:right w:type="dxa" w:w="120"/>
+            </w:tcMar>
+          </w:tcPr>
+          <w:p>
+            <w:pPr>
+              <w:spacing w:line="276"/>
+              <w:jc w:val="left"/>
+            </w:pPr>
+            <w:r>
+              <w:rPr>
+                <w:b w:val="false"/>
+                <w:bCs w:val="false"/>
+                <w:color w:val="1A1A1A"/>
+                <w:sz w:val="20"/>
+                <w:szCs w:val="20"/>
+                <w:rFonts w:ascii="Times New Roman" w:eastAsia="SimSun"/>
+              </w:rPr>
+              <w:t xml:space="preserve">自动</w:t>
+            </w:r>
+          </w:p>
+        </w:tc>
+        <w:tc>
+          <w:tcPr>
+            <w:tcW w:type="pct" w:w="25%"/>
+            <w:tcMar>
+              <w:top w:type="dxa" w:w="60"/>
+              <w:left w:type="dxa" w:w="120"/>
+              <w:bottom w:type="dxa" w:w="60"/>
+              <w:right w:type="dxa" w:w="120"/>
+            </w:tcMar>
+          </w:tcPr>
+          <w:p>
+            <w:pPr>
+              <w:spacing w:line="276"/>
+              <w:jc w:val="left"/>
+            </w:pPr>
+            <w:r>
+              <w:rPr>
+                <w:b w:val="false"/>
+                <w:bCs w:val="false"/>
+                <w:color w:val="1A1A1A"/>
+                <w:sz w:val="20"/>
+                <w:szCs w:val="20"/>
+                <w:rFonts w:ascii="Times New Roman" w:eastAsia="SimSun"/>
+              </w:rPr>
+              <w:t xml:space="preserve">Agent → 自动</w:t>
+            </w:r>
+          </w:p>
+        </w:tc>
+        <w:tc>
+          <w:tcPr>
+            <w:tcW w:type="pct" w:w="25%"/>
+            <w:tcMar>
+              <w:top w:type="dxa" w:w="60"/>
+              <w:left w:type="dxa" w:w="120"/>
+              <w:bottom w:type="dxa" w:w="60"/>
+              <w:right w:type="dxa" w:w="120"/>
+            </w:tcMar>
+          </w:tcPr>
+          <w:p>
+            <w:pPr>
+              <w:spacing w:line="276"/>
+              <w:jc w:val="left"/>
+            </w:pPr>
+            <w:r>
+              <w:rPr>
+                <w:b w:val="false"/>
+                <w:bCs w:val="false"/>
+                <w:color w:val="1A1A1A"/>
+                <w:sz w:val="20"/>
+                <w:szCs w:val="20"/>
+                <w:rFonts w:ascii="Times New Roman" w:eastAsia="SimSun"/>
+              </w:rPr>
+              <w:t xml:space="preserve">保留旧会话的混合路由</w:t>
+            </w:r>
+          </w:p>
+        </w:tc>
+        <w:tc>
+          <w:tcPr>
+            <w:tcW w:type="pct" w:w="25%"/>
+            <w:tcMar>
+              <w:top w:type="dxa" w:w="60"/>
+              <w:left w:type="dxa" w:w="120"/>
+              <w:bottom w:type="dxa" w:w="60"/>
+              <w:right w:type="dxa" w:w="120"/>
+            </w:tcMar>
+          </w:tcPr>
+          <w:p>
+            <w:pPr>
+              <w:spacing w:line="276"/>
+              <w:jc w:val="left"/>
+            </w:pPr>
+            <w:r>
+              <w:rPr>
+                <w:b w:val="false"/>
+                <w:bCs w:val="false"/>
+                <w:color w:val="1A1A1A"/>
+                <w:sz w:val="20"/>
+                <w:szCs w:val="20"/>
+                <w:rFonts w:ascii="Times New Roman" w:eastAsia="SimSun"/>
+              </w:rPr>
+              <w:t xml:space="preserve">适合旧 Agent 会话；新会话也可主动选择</w:t>
+            </w:r>
+          </w:p>
+        </w:tc>
+      </w:tr>
+      <w:tr>
+        <w:trPr>
+          <w:cantSplit/>
+        </w:trPr>
+        <w:tc>
+          <w:tcPr>
+            <w:tcW w:type="pct" w:w="25%"/>
+            <w:tcMar>
+              <w:top w:type="dxa" w:w="60"/>
+              <w:left w:type="dxa" w:w="120"/>
+              <w:bottom w:type="dxa" w:w="60"/>
+              <w:right w:type="dxa" w:w="120"/>
+            </w:tcMar>
+          </w:tcPr>
+          <w:p>
+            <w:pPr>
+              <w:spacing w:line="276"/>
+              <w:jc w:val="left"/>
+            </w:pPr>
+            <w:r>
+              <w:rPr>
+                <w:b w:val="false"/>
+                <w:bCs w:val="false"/>
+                <w:color w:val="1A1A1A"/>
+                <w:sz w:val="20"/>
+                <w:szCs w:val="20"/>
+                <w:rFonts w:ascii="Times New Roman" w:eastAsia="SimSun"/>
+              </w:rPr>
+              <w:t xml:space="preserve">普通对话</w:t>
+            </w:r>
+          </w:p>
+        </w:tc>
+        <w:tc>
+          <w:tcPr>
+            <w:tcW w:type="pct" w:w="25%"/>
+            <w:tcMar>
+              <w:top w:type="dxa" w:w="60"/>
+              <w:left w:type="dxa" w:w="120"/>
+              <w:bottom w:type="dxa" w:w="60"/>
+              <w:right w:type="dxa" w:w="120"/>
+            </w:tcMar>
+          </w:tcPr>
+          <w:p>
+            <w:pPr>
+              <w:spacing w:line="276"/>
+              <w:jc w:val="left"/>
+            </w:pPr>
+            <w:r>
+              <w:rPr>
+                <w:b w:val="false"/>
+                <w:bCs w:val="false"/>
+                <w:color w:val="1A1A1A"/>
+                <w:sz w:val="20"/>
+                <w:szCs w:val="20"/>
+                <w:rFonts w:ascii="Times New Roman" w:eastAsia="SimSun"/>
+              </w:rPr>
+              <w:t xml:space="preserve">对话页</w:t>
+            </w:r>
+          </w:p>
+        </w:tc>
+        <w:tc>
+          <w:tcPr>
+            <w:tcW w:type="pct" w:w="25%"/>
+            <w:tcMar>
+              <w:top w:type="dxa" w:w="60"/>
+              <w:left w:type="dxa" w:w="120"/>
+              <w:bottom w:type="dxa" w:w="60"/>
+              <w:right w:type="dxa" w:w="120"/>
+            </w:tcMar>
+          </w:tcPr>
+          <w:p>
+            <w:pPr>
+              <w:spacing w:line="276"/>
+              <w:jc w:val="left"/>
+            </w:pPr>
+            <w:r>
+              <w:rPr>
+                <w:b w:val="false"/>
+                <w:bCs w:val="false"/>
+                <w:color w:val="1A1A1A"/>
+                <w:sz w:val="20"/>
+                <w:szCs w:val="20"/>
+                <w:rFonts w:ascii="Times New Roman" w:eastAsia="SimSun"/>
+              </w:rPr>
+              <w:t xml:space="preserve">默认只做模型问答，不读程序、表结构或表数据</w:t>
+            </w:r>
+          </w:p>
+        </w:tc>
+        <w:tc>
+          <w:tcPr>
+            <w:tcW w:type="pct" w:w="25%"/>
+            <w:tcMar>
+              <w:top w:type="dxa" w:w="60"/>
+              <w:left w:type="dxa" w:w="120"/>
+              <w:bottom w:type="dxa" w:w="60"/>
+              <w:right w:type="dxa" w:w="120"/>
+            </w:tcMar>
+          </w:tcPr>
+          <w:p>
+            <w:pPr>
+              <w:spacing w:line="276"/>
+              <w:jc w:val="left"/>
+            </w:pPr>
+            <w:r>
+              <w:rPr>
+                <w:b w:val="false"/>
+                <w:bCs w:val="false"/>
+                <w:color w:val="1A1A1A"/>
+                <w:sz w:val="20"/>
+                <w:szCs w:val="20"/>
+                <w:rFonts w:ascii="Times New Roman" w:eastAsia="SimSun"/>
+              </w:rPr>
+              <w:t xml:space="preserve">点名 SAP 对象时显示“转到 Agent”建议卡片；维护 </w:t>
+            </w:r>
+            <w:r>
+              <w:rPr>
+                <w:b w:val="false"/>
+                <w:bCs w:val="false"/>
+                <w:color w:val="9C2B4B"/>
+                <w:sz w:val="20"/>
+                <w:szCs w:val="20"/>
+                <w:rFonts w:ascii="Consolas" w:eastAsia="Microsoft YaHei"/>
+              </w:rPr>
+              <w:t xml:space="preserve">CHAT_SAP_ACCESS=X</w:t>
+            </w:r>
+            <w:r>
+              <w:rPr>
+                <w:b w:val="false"/>
+                <w:bCs w:val="false"/>
+                <w:color w:val="1A1A1A"/>
+                <w:sz w:val="20"/>
+                <w:szCs w:val="20"/>
+                <w:rFonts w:ascii="Times New Roman" w:eastAsia="SimSun"/>
+              </w:rPr>
+              <w:t xml:space="preserve"> 才恢复旧读取行为</w:t>
+            </w:r>
+          </w:p>
+        </w:tc>
+      </w:tr>
+    </w:tbl>
+    <w:p>
+      <w:pPr>
+        <w:spacing w:after="60"/>
+      </w:pPr>
+    </w:p>
+    <w:p>
+      <w:pPr>
+        <w:pStyle w:val="Heading2"/>
+        <w:spacing w:before="240" w:after="120" w:line="312"/>
+      </w:pPr>
+      <w:r>
+        <w:rPr>
           <w:b/>
           <w:bCs/>
+          <w:color w:val="1B6B7A"/>
+          <w:sz w:val="28"/>
+          <w:szCs w:val="28"/>
+          <w:rFonts w:ascii="Arial" w:eastAsia="SimHei"/>
+        </w:rPr>
+        <w:t xml:space="preserve">三-A.1 报表结果为什么现在能直接分析</w:t>
+      </w:r>
+    </w:p>
+    <w:p>
+      <w:pPr>
+        <w:spacing w:line="312" w:after="60"/>
+        <w:ind w:firstLine="480"/>
+        <w:jc w:val="both"/>
+      </w:pPr>
+      <w:r>
+        <w:rPr>
+          <w:b w:val="false"/>
+          <w:bCs w:val="false"/>
           <w:color w:val="1A1A1A"/>
           <w:sz w:val="24"/>
           <w:szCs w:val="24"/>
           <w:rFonts w:ascii="Times New Roman" w:eastAsia="SimSun"/>
         </w:rPr>
-        <w:t xml:space="preserve">全链路已通</w:t>
-      </w:r>
-      <w:r>
-        <w:rPr>
-          <w:b w:val="false"/>
-          <w:bCs w:val="false"/>
-          <w:color w:val="1A1A1A"/>
+        <w:t xml:space="preserve">前端把当前结果的 </w:t>
+      </w:r>
+      <w:r>
+        <w:rPr>
+          <w:b w:val="false"/>
+          <w:bCs w:val="false"/>
+          <w:color w:val="9C2B4B"/>
           <w:sz w:val="24"/>
           <w:szCs w:val="24"/>
-          <w:rFonts w:ascii="Times New Roman" w:eastAsia="SimSun"/>
-        </w:rPr>
-        <w:t xml:space="preserve">：服务器部署 ✅ → SAP 网关登录 ✅ → 应用级登录 ✅ → 聊天 ✅ → 表数据查询 ✅。</w:t>
+          <w:rFonts w:ascii="Consolas" w:eastAsia="Microsoft YaHei"/>
+        </w:rPr>
+        <w:t xml:space="preserve">FocusedArtifactId</w:t>
+      </w:r>
+      <w:r>
+        <w:rPr>
+          <w:b w:val="false"/>
+          <w:bCs w:val="false"/>
+          <w:color w:val="1A1A1A"/>
+          <w:sz w:val="24"/>
+          <w:szCs w:val="24"/>
+          <w:rFonts w:ascii="Times New Roman" w:eastAsia="SimSun"/>
+        </w:rPr>
+        <w:t xml:space="preserve"> 作为候选值传给 </w:t>
+      </w:r>
+      <w:r>
+        <w:rPr>
+          <w:b w:val="false"/>
+          <w:bCs w:val="false"/>
+          <w:color w:val="9C2B4B"/>
+          <w:sz w:val="24"/>
+          <w:szCs w:val="24"/>
+          <w:rFonts w:ascii="Consolas" w:eastAsia="Microsoft YaHei"/>
+        </w:rPr>
+        <w:t xml:space="preserve">AnalyzeTask</w:t>
+      </w:r>
+      <w:r>
+        <w:rPr>
+          <w:b w:val="false"/>
+          <w:bCs w:val="false"/>
+          <w:color w:val="1A1A1A"/>
+          <w:sz w:val="24"/>
+          <w:szCs w:val="24"/>
+          <w:rFonts w:ascii="Times New Roman" w:eastAsia="SimSun"/>
+        </w:rPr>
+        <w:t xml:space="preserve">，后端先验证结果是否属于当前会话、是否 READY、是否仍可读；验证通过后把结果字段、行和来源摘要注入模型上下文。没有聚焦值时，后端按会话和 TCode 找最近可用 Artifact。这个路径不会重新跑报表，也不会把同一句追问误判成新的 DATA 任务。</w:t>
+      </w:r>
+    </w:p>
+    <w:p>
+      <w:pPr>
+        <w:pStyle w:val="Heading2"/>
+        <w:spacing w:before="240" w:after="120" w:line="312"/>
+      </w:pPr>
+      <w:r>
+        <w:rPr>
+          <w:b/>
+          <w:bCs/>
+          <w:color w:val="1B6B7A"/>
+          <w:sz w:val="28"/>
+          <w:szCs w:val="28"/>
+          <w:rFonts w:ascii="Arial" w:eastAsia="SimHei"/>
+        </w:rPr>
+        <w:t xml:space="preserve">三-A.2 Agent 模型白名单</w:t>
+      </w:r>
+    </w:p>
+    <w:p>
+      <w:pPr>
+        <w:spacing w:line="312" w:after="60"/>
+        <w:ind w:firstLine="480"/>
+        <w:jc w:val="both"/>
+      </w:pPr>
+      <w:r>
+        <w:rPr>
+          <w:b w:val="false"/>
+          <w:bCs w:val="false"/>
+          <w:color w:val="1A1A1A"/>
+          <w:sz w:val="24"/>
+          <w:szCs w:val="24"/>
+          <w:rFonts w:ascii="Times New Roman" w:eastAsia="SimSun"/>
+        </w:rPr>
+        <w:t xml:space="preserve">管理员在“设置 → 模型管理 → Agent 可用模型”里选择可用于 Agent 的模型。后端配置键为 </w:t>
+      </w:r>
+      <w:r>
+        <w:rPr>
+          <w:b w:val="false"/>
+          <w:bCs w:val="false"/>
+          <w:color w:val="9C2B4B"/>
+          <w:sz w:val="24"/>
+          <w:szCs w:val="24"/>
+          <w:rFonts w:ascii="Consolas" w:eastAsia="Microsoft YaHei"/>
+        </w:rPr>
+        <w:t xml:space="preserve">AGENT_MODELS</w:t>
+      </w:r>
+      <w:r>
+        <w:rPr>
+          <w:b w:val="false"/>
+          <w:bCs w:val="false"/>
+          <w:color w:val="1A1A1A"/>
+          <w:sz w:val="24"/>
+          <w:szCs w:val="24"/>
+          <w:rFonts w:ascii="Times New Roman" w:eastAsia="SimSun"/>
+        </w:rPr>
+        <w:t xml:space="preserve">、</w:t>
+      </w:r>
+      <w:r>
+        <w:rPr>
+          <w:b w:val="false"/>
+          <w:bCs w:val="false"/>
+          <w:color w:val="9C2B4B"/>
+          <w:sz w:val="24"/>
+          <w:szCs w:val="24"/>
+          <w:rFonts w:ascii="Consolas" w:eastAsia="Microsoft YaHei"/>
+        </w:rPr>
+        <w:t xml:space="preserve">AGENT_MODELS_RPT</w:t>
+      </w:r>
+      <w:r>
+        <w:rPr>
+          <w:b w:val="false"/>
+          <w:bCs w:val="false"/>
+          <w:color w:val="1A1A1A"/>
+          <w:sz w:val="24"/>
+          <w:szCs w:val="24"/>
+          <w:rFonts w:ascii="Times New Roman" w:eastAsia="SimSun"/>
+        </w:rPr>
+        <w:t xml:space="preserve">、</w:t>
+      </w:r>
+      <w:r>
+        <w:rPr>
+          <w:b w:val="false"/>
+          <w:bCs w:val="false"/>
+          <w:color w:val="9C2B4B"/>
+          <w:sz w:val="24"/>
+          <w:szCs w:val="24"/>
+          <w:rFonts w:ascii="Consolas" w:eastAsia="Microsoft YaHei"/>
+        </w:rPr>
+        <w:t xml:space="preserve">AGENT_MODELS_DATA</w:t>
+      </w:r>
+      <w:r>
+        <w:rPr>
+          <w:b w:val="false"/>
+          <w:bCs w:val="false"/>
+          <w:color w:val="1A1A1A"/>
+          <w:sz w:val="24"/>
+          <w:szCs w:val="24"/>
+          <w:rFonts w:ascii="Times New Roman" w:eastAsia="SimSun"/>
+        </w:rPr>
+        <w:t xml:space="preserve">、</w:t>
+      </w:r>
+      <w:r>
+        <w:rPr>
+          <w:b w:val="false"/>
+          <w:bCs w:val="false"/>
+          <w:color w:val="9C2B4B"/>
+          <w:sz w:val="24"/>
+          <w:szCs w:val="24"/>
+          <w:rFonts w:ascii="Consolas" w:eastAsia="Microsoft YaHei"/>
+        </w:rPr>
+        <w:t xml:space="preserve">AGENT_MODELS_INV</w:t>
+      </w:r>
+      <w:r>
+        <w:rPr>
+          <w:b w:val="false"/>
+          <w:bCs w:val="false"/>
+          <w:color w:val="1A1A1A"/>
+          <w:sz w:val="24"/>
+          <w:szCs w:val="24"/>
+          <w:rFonts w:ascii="Times New Roman" w:eastAsia="SimSun"/>
+        </w:rPr>
+        <w:t xml:space="preserve">、</w:t>
+      </w:r>
+      <w:r>
+        <w:rPr>
+          <w:b w:val="false"/>
+          <w:bCs w:val="false"/>
+          <w:color w:val="9C2B4B"/>
+          <w:sz w:val="24"/>
+          <w:szCs w:val="24"/>
+          <w:rFonts w:ascii="Consolas" w:eastAsia="Microsoft YaHei"/>
+        </w:rPr>
+        <w:t xml:space="preserve">AGENT_MODELS_CODE</w:t>
+      </w:r>
+      <w:r>
+        <w:rPr>
+          <w:b w:val="false"/>
+          <w:bCs w:val="false"/>
+          <w:color w:val="1A1A1A"/>
+          <w:sz w:val="24"/>
+          <w:szCs w:val="24"/>
+          <w:rFonts w:ascii="Times New Roman" w:eastAsia="SimSun"/>
+        </w:rPr>
+        <w:t xml:space="preserve">；场景专属键优先于全局键，所有键为空代表不限制。前端下拉会过滤，后端仍会拒绝手动指定的未开放模型，因此不能绕过配置。</w:t>
+      </w:r>
+    </w:p>
+    <w:p>
+      <w:pPr>
+        <w:pStyle w:val="Heading2"/>
+        <w:spacing w:before="240" w:after="120" w:line="312"/>
+      </w:pPr>
+      <w:r>
+        <w:rPr>
+          <w:b/>
+          <w:bCs/>
+          <w:color w:val="1B6B7A"/>
+          <w:sz w:val="28"/>
+          <w:szCs w:val="28"/>
+          <w:rFonts w:ascii="Arial" w:eastAsia="SimHei"/>
+        </w:rPr>
+        <w:t xml:space="preserve">三-A.3 管理员 Agent 测评：先测，再改</w:t>
+      </w:r>
+    </w:p>
+    <w:p>
+      <w:pPr>
+        <w:spacing w:line="312" w:after="60"/>
+        <w:ind w:firstLine="480"/>
+        <w:jc w:val="both"/>
+      </w:pPr>
+      <w:r>
+        <w:rPr>
+          <w:b w:val="false"/>
+          <w:bCs w:val="false"/>
+          <w:color w:val="1A1A1A"/>
+          <w:sz w:val="24"/>
+          <w:szCs w:val="24"/>
+          <w:rFonts w:ascii="Times New Roman" w:eastAsia="SimSun"/>
+        </w:rPr>
+        <w:t xml:space="preserve">设置页新增“测评”页签，只有 </w:t>
+      </w:r>
+      <w:r>
+        <w:rPr>
+          <w:b w:val="false"/>
+          <w:bCs w:val="false"/>
+          <w:color w:val="9C2B4B"/>
+          <w:sz w:val="24"/>
+          <w:szCs w:val="24"/>
+          <w:rFonts w:ascii="Consolas" w:eastAsia="Microsoft YaHei"/>
+        </w:rPr>
+        <w:t xml:space="preserve">ADMIN</w:t>
+      </w:r>
+      <w:r>
+        <w:rPr>
+          <w:b w:val="false"/>
+          <w:bCs w:val="false"/>
+          <w:color w:val="1A1A1A"/>
+          <w:sz w:val="24"/>
+          <w:szCs w:val="24"/>
+          <w:rFonts w:ascii="Times New Roman" w:eastAsia="SimSun"/>
+        </w:rPr>
+        <w:t xml:space="preserve"> 能看到。点击“打开 Agent 测评”后，前端读取随 BSP 发布的 </w:t>
+      </w:r>
+      <w:r>
+        <w:rPr>
+          <w:b w:val="false"/>
+          <w:bCs w:val="false"/>
+          <w:color w:val="9C2B4B"/>
+          <w:sz w:val="24"/>
+          <w:szCs w:val="24"/>
+          <w:rFonts w:ascii="Consolas" w:eastAsia="Microsoft YaHei"/>
+        </w:rPr>
+        <w:t xml:space="preserve">webapp/model/evalCases.json</w:t>
+      </w:r>
+      <w:r>
+        <w:rPr>
+          <w:b w:val="false"/>
+          <w:bCs w:val="false"/>
+          <w:color w:val="1A1A1A"/>
+          <w:sz w:val="24"/>
+          <w:szCs w:val="24"/>
+          <w:rFonts w:ascii="Times New Roman" w:eastAsia="SimSun"/>
+        </w:rPr>
+        <w:t xml:space="preserve">（当前题库版本 </w:t>
+      </w:r>
+      <w:r>
+        <w:rPr>
+          <w:b w:val="false"/>
+          <w:bCs w:val="false"/>
+          <w:color w:val="9C2B4B"/>
+          <w:sz w:val="24"/>
+          <w:szCs w:val="24"/>
+          <w:rFonts w:ascii="Consolas" w:eastAsia="Microsoft YaHei"/>
+        </w:rPr>
+        <w:t xml:space="preserve">20261011</w:t>
+      </w:r>
+      <w:r>
+        <w:rPr>
+          <w:b w:val="false"/>
+          <w:bCs w:val="false"/>
+          <w:color w:val="1A1A1A"/>
+          <w:sz w:val="24"/>
+          <w:szCs w:val="24"/>
+          <w:rFonts w:ascii="Times New Roman" w:eastAsia="SimSun"/>
+        </w:rPr>
+        <w:t xml:space="preserve">，29 题），再通过和真实用户完全相同的 </w:t>
+      </w:r>
+      <w:r>
+        <w:rPr>
+          <w:b w:val="false"/>
+          <w:bCs w:val="false"/>
+          <w:color w:val="9C2B4B"/>
+          <w:sz w:val="24"/>
+          <w:szCs w:val="24"/>
+          <w:rFonts w:ascii="Consolas" w:eastAsia="Microsoft YaHei"/>
+        </w:rPr>
+        <w:t xml:space="preserve">ChatService.sendTask → AnalyzeTask → ABAP → SM59 → 模型</w:t>
+      </w:r>
+      <w:r>
+        <w:rPr>
+          <w:b w:val="false"/>
+          <w:bCs w:val="false"/>
+          <w:color w:val="1A1A1A"/>
+          <w:sz w:val="24"/>
+          <w:szCs w:val="24"/>
+          <w:rFonts w:ascii="Times New Roman" w:eastAsia="SimSun"/>
+        </w:rPr>
+        <w:t xml:space="preserve"> 链路逐题执行。测评模块不是另一套模拟接口，也不会绕过 Agent 的场景边界、工具白名单或 SAP 权限。</w:t>
+      </w:r>
+    </w:p>
+    <w:p>
+      <w:pPr>
+        <w:spacing w:line="312" w:after="60"/>
+        <w:ind w:firstLine="480"/>
+        <w:jc w:val="both"/>
+      </w:pPr>
+      <w:r>
+        <w:rPr>
+          <w:b w:val="false"/>
+          <w:bCs w:val="false"/>
+          <w:color w:val="1A1A1A"/>
+          <w:sz w:val="24"/>
+          <w:szCs w:val="24"/>
+          <w:rFonts w:ascii="Times New Roman" w:eastAsia="SimSun"/>
+        </w:rPr>
+        <w:t xml:space="preserve">题库按五个场景分组：DATA 12 题（D01-D12）、REPORT 5 题（R01-R05）、INVENTORY 3 题（I01-I03）、CODE 5 题（C01-C05）、AUTO 4 题（G01-G04）。题目可以是一轮或最多五轮连续对话；同一题的多轮复用同一个临时会话，题与题之间顺序执行，不并发占用 SAP 后台对话进程。默认每题跑 1 次，界面可选择场景、模型和重复次数（代码将重复次数限制在 1~5）。</w:t>
+      </w:r>
+    </w:p>
+    <w:p>
+      <w:pPr>
+        <w:spacing w:line="312" w:after="60"/>
+        <w:ind w:firstLine="480"/>
+        <w:jc w:val="both"/>
+      </w:pPr>
+      <w:r>
+        <w:rPr>
+          <w:b w:val="false"/>
+          <w:bCs w:val="false"/>
+          <w:color w:val="1A1A1A"/>
+          <w:sz w:val="24"/>
+          <w:szCs w:val="24"/>
+          <w:rFonts w:ascii="Times New Roman" w:eastAsia="SimSun"/>
+        </w:rPr>
+        <w:t xml:space="preserve">每题按 </w:t>
+      </w:r>
+      <w:r>
+        <w:rPr>
+          <w:b w:val="false"/>
+          <w:bCs w:val="false"/>
+          <w:color w:val="9C2B4B"/>
+          <w:sz w:val="24"/>
+          <w:szCs w:val="24"/>
+          <w:rFonts w:ascii="Consolas" w:eastAsia="Microsoft YaHei"/>
+        </w:rPr>
+        <w:t xml:space="preserve">expect</w:t>
+      </w:r>
+      <w:r>
+        <w:rPr>
+          <w:b w:val="false"/>
+          <w:bCs w:val="false"/>
+          <w:color w:val="1A1A1A"/>
+          <w:sz w:val="24"/>
+          <w:szCs w:val="24"/>
+          <w:rFonts w:ascii="Times New Roman" w:eastAsia="SimSun"/>
+        </w:rPr>
+        <w:t xml:space="preserve"> 自动检查：所有轮次状态、最后一轮的工具调用（</w:t>
+      </w:r>
+      <w:r>
+        <w:rPr>
+          <w:b w:val="false"/>
+          <w:bCs w:val="false"/>
+          <w:color w:val="9C2B4B"/>
+          <w:sz w:val="24"/>
+          <w:szCs w:val="24"/>
+          <w:rFonts w:ascii="Consolas" w:eastAsia="Microsoft YaHei"/>
+        </w:rPr>
+        <w:t xml:space="preserve">tools</w:t>
+      </w:r>
+      <w:r>
+        <w:rPr>
+          <w:b w:val="false"/>
+          <w:bCs w:val="false"/>
+          <w:color w:val="1A1A1A"/>
+          <w:sz w:val="24"/>
+          <w:szCs w:val="24"/>
+          <w:rFonts w:ascii="Times New Roman" w:eastAsia="SimSun"/>
+        </w:rPr>
+        <w:t xml:space="preserve">/</w:t>
+      </w:r>
+      <w:r>
+        <w:rPr>
+          <w:b w:val="false"/>
+          <w:bCs w:val="false"/>
+          <w:color w:val="9C2B4B"/>
+          <w:sz w:val="24"/>
+          <w:szCs w:val="24"/>
+          <w:rFonts w:ascii="Consolas" w:eastAsia="Microsoft YaHei"/>
+        </w:rPr>
+        <w:t xml:space="preserve">toolsAny</w:t>
+      </w:r>
+      <w:r>
+        <w:rPr>
+          <w:b w:val="false"/>
+          <w:bCs w:val="false"/>
+          <w:color w:val="1A1A1A"/>
+          <w:sz w:val="24"/>
+          <w:szCs w:val="24"/>
+          <w:rFonts w:ascii="Times New Roman" w:eastAsia="SimSun"/>
+        </w:rPr>
+        <w:t xml:space="preserve">）、不应调用的工具（</w:t>
+      </w:r>
+      <w:r>
+        <w:rPr>
+          <w:b w:val="false"/>
+          <w:bCs w:val="false"/>
+          <w:color w:val="9C2B4B"/>
+          <w:sz w:val="24"/>
+          <w:szCs w:val="24"/>
+          <w:rFonts w:ascii="Consolas" w:eastAsia="Microsoft YaHei"/>
+        </w:rPr>
+        <w:t xml:space="preserve">noTools</w:t>
+      </w:r>
+      <w:r>
+        <w:rPr>
+          <w:b w:val="false"/>
+          <w:bCs w:val="false"/>
+          <w:color w:val="1A1A1A"/>
+          <w:sz w:val="24"/>
+          <w:szCs w:val="24"/>
+          <w:rFonts w:ascii="Times New Roman" w:eastAsia="SimSun"/>
+        </w:rPr>
+        <w:t xml:space="preserve">/</w:t>
+      </w:r>
+      <w:r>
+        <w:rPr>
+          <w:b w:val="false"/>
+          <w:bCs w:val="false"/>
+          <w:color w:val="9C2B4B"/>
+          <w:sz w:val="24"/>
+          <w:szCs w:val="24"/>
+          <w:rFonts w:ascii="Consolas" w:eastAsia="Microsoft YaHei"/>
+        </w:rPr>
+        <w:t xml:space="preserve">toolsNotOk</w:t>
+      </w:r>
+      <w:r>
+        <w:rPr>
+          <w:b w:val="false"/>
+          <w:bCs w:val="false"/>
+          <w:color w:val="1A1A1A"/>
+          <w:sz w:val="24"/>
+          <w:szCs w:val="24"/>
+          <w:rFonts w:ascii="Times New Roman" w:eastAsia="SimSun"/>
+        </w:rPr>
+        <w:t xml:space="preserve">）、回答关键词或正则（</w:t>
+      </w:r>
+      <w:r>
+        <w:rPr>
+          <w:b w:val="false"/>
+          <w:bCs w:val="false"/>
+          <w:color w:val="9C2B4B"/>
+          <w:sz w:val="24"/>
+          <w:szCs w:val="24"/>
+          <w:rFonts w:ascii="Consolas" w:eastAsia="Microsoft YaHei"/>
+        </w:rPr>
+        <w:t xml:space="preserve">answerAll</w:t>
+      </w:r>
+      <w:r>
+        <w:rPr>
+          <w:b w:val="false"/>
+          <w:bCs w:val="false"/>
+          <w:color w:val="1A1A1A"/>
+          <w:sz w:val="24"/>
+          <w:szCs w:val="24"/>
+          <w:rFonts w:ascii="Times New Roman" w:eastAsia="SimSun"/>
+        </w:rPr>
+        <w:t xml:space="preserve">/</w:t>
+      </w:r>
+      <w:r>
+        <w:rPr>
+          <w:b w:val="false"/>
+          <w:bCs w:val="false"/>
+          <w:color w:val="9C2B4B"/>
+          <w:sz w:val="24"/>
+          <w:szCs w:val="24"/>
+          <w:rFonts w:ascii="Consolas" w:eastAsia="Microsoft YaHei"/>
+        </w:rPr>
+        <w:t xml:space="preserve">answerAny</w:t>
+      </w:r>
+      <w:r>
+        <w:rPr>
+          <w:b w:val="false"/>
+          <w:bCs w:val="false"/>
+          <w:color w:val="1A1A1A"/>
+          <w:sz w:val="24"/>
+          <w:szCs w:val="24"/>
+          <w:rFonts w:ascii="Times New Roman" w:eastAsia="SimSun"/>
+        </w:rPr>
+        <w:t xml:space="preserve">/</w:t>
+      </w:r>
+      <w:r>
+        <w:rPr>
+          <w:b w:val="false"/>
+          <w:bCs w:val="false"/>
+          <w:color w:val="9C2B4B"/>
+          <w:sz w:val="24"/>
+          <w:szCs w:val="24"/>
+          <w:rFonts w:ascii="Consolas" w:eastAsia="Microsoft YaHei"/>
+        </w:rPr>
+        <w:t xml:space="preserve">answerRegex</w:t>
+      </w:r>
+      <w:r>
+        <w:rPr>
+          <w:b w:val="false"/>
+          <w:bCs w:val="false"/>
+          <w:color w:val="1A1A1A"/>
+          <w:sz w:val="24"/>
+          <w:szCs w:val="24"/>
+          <w:rFonts w:ascii="Times New Roman" w:eastAsia="SimSun"/>
+        </w:rPr>
+        <w:t xml:space="preserve">）、最大 Agent 轮数、前端实测墙钟耗时、任务模块、是否需要参数卡、是否为确定性应答。结果会记录会话 ID、问题、状态、轮数、模型耗时、墙钟耗时、工具名/状态/行数、被拒次数、SQL 执行次数、协议错误、回答和失败原因。</w:t>
+      </w:r>
+    </w:p>
+    <w:p>
+      <w:pPr>
+        <w:spacing w:line="312" w:after="60"/>
+        <w:ind w:firstLine="480"/>
+        <w:jc w:val="both"/>
+      </w:pPr>
+      <w:r>
+        <w:rPr>
+          <w:b w:val="false"/>
+          <w:bCs w:val="false"/>
+          <w:color w:val="9C2B4B"/>
+          <w:sz w:val="24"/>
+          <w:szCs w:val="24"/>
+          <w:rFonts w:ascii="Consolas" w:eastAsia="Microsoft YaHei"/>
+        </w:rPr>
+        <w:t xml:space="preserve">requiresScene=true</w:t>
+      </w:r>
+      <w:r>
+        <w:rPr>
+          <w:b w:val="false"/>
+          <w:bCs w:val="false"/>
+          <w:color w:val="1A1A1A"/>
+          <w:sz w:val="24"/>
+          <w:szCs w:val="24"/>
+          <w:rFonts w:ascii="Times New Roman" w:eastAsia="SimSun"/>
+        </w:rPr>
+        <w:t xml:space="preserve"> 的题依赖 SEGW </w:t>
+      </w:r>
+      <w:r>
+        <w:rPr>
+          <w:b w:val="false"/>
+          <w:bCs w:val="false"/>
+          <w:color w:val="9C2B4B"/>
+          <w:sz w:val="24"/>
+          <w:szCs w:val="24"/>
+          <w:rFonts w:ascii="Consolas" w:eastAsia="Microsoft YaHei"/>
+        </w:rPr>
+        <w:t xml:space="preserve">AnalyzeTask.Scene</w:t>
+      </w:r>
+      <w:r>
+        <w:rPr>
+          <w:b w:val="false"/>
+          <w:bCs w:val="false"/>
+          <w:color w:val="1A1A1A"/>
+          <w:sz w:val="24"/>
+          <w:szCs w:val="24"/>
+          <w:rFonts w:ascii="Times New Roman" w:eastAsia="SimSun"/>
+        </w:rPr>
+        <w:t xml:space="preserve"> 参数。后端 metadata 尚未加入 </w:t>
+      </w:r>
+      <w:r>
+        <w:rPr>
+          <w:b w:val="false"/>
+          <w:bCs w:val="false"/>
+          <w:color w:val="9C2B4B"/>
+          <w:sz w:val="24"/>
+          <w:szCs w:val="24"/>
+          <w:rFonts w:ascii="Consolas" w:eastAsia="Microsoft YaHei"/>
+        </w:rPr>
+        <w:t xml:space="preserve">Scene</w:t>
+      </w:r>
+      <w:r>
+        <w:rPr>
+          <w:b w:val="false"/>
+          <w:bCs w:val="false"/>
+          <w:color w:val="1A1A1A"/>
+          <w:sz w:val="24"/>
+          <w:szCs w:val="24"/>
+          <w:rFonts w:ascii="Times New Roman" w:eastAsia="SimSun"/>
+        </w:rPr>
+        <w:t xml:space="preserve"> 时，这些题会明确标记“跳过”，其他题按 </w:t>
+      </w:r>
+      <w:r>
+        <w:rPr>
+          <w:b w:val="false"/>
+          <w:bCs w:val="false"/>
+          <w:color w:val="9C2B4B"/>
+          <w:sz w:val="24"/>
+          <w:szCs w:val="24"/>
+          <w:rFonts w:ascii="Consolas" w:eastAsia="Microsoft YaHei"/>
+        </w:rPr>
+        <w:t xml:space="preserve">AUTO</w:t>
+      </w:r>
+      <w:r>
+        <w:rPr>
+          <w:b w:val="false"/>
+          <w:bCs w:val="false"/>
+          <w:color w:val="1A1A1A"/>
+          <w:sz w:val="24"/>
+          <w:szCs w:val="24"/>
+          <w:rFonts w:ascii="Times New Roman" w:eastAsia="SimSun"/>
+        </w:rPr>
+        <w:t xml:space="preserve"> 运行；不能把跳过当成通过。演示模式可打开界面，但返回的是内置示例，不代表真实模型或 SAP 数据能力。测评默认勾选“测完删除测试会话”，停止按钮会在当前题结束后停止，不会强杀正在执行的请求。</w:t>
+      </w:r>
+    </w:p>
+    <w:p>
+      <w:pPr>
+        <w:spacing w:line="312" w:after="60"/>
+        <w:ind w:firstLine="480"/>
+        <w:jc w:val="both"/>
+      </w:pPr>
+      <w:r>
+        <w:rPr>
+          <w:b w:val="false"/>
+          <w:bCs w:val="false"/>
+          <w:color w:val="1A1A1A"/>
+          <w:sz w:val="24"/>
+          <w:szCs w:val="24"/>
+          <w:rFonts w:ascii="Times New Roman" w:eastAsia="SimSun"/>
+        </w:rPr>
+        <w:t xml:space="preserve">测评结束后可导出三类证据：Markdown 汇总报告（总通过率、按场景通过率、平均/最长耗时、平均轮数、错误/超时/协议错误、工具被拒次数及失败回答）、JSON 明细（逐轮原始记录）和 JSON 题库。管理员可以编辑后按 </w:t>
+      </w:r>
+      <w:r>
+        <w:rPr>
+          <w:b w:val="false"/>
+          <w:bCs w:val="false"/>
+          <w:color w:val="9C2B4B"/>
+          <w:sz w:val="24"/>
+          <w:szCs w:val="24"/>
+          <w:rFonts w:ascii="Consolas" w:eastAsia="Microsoft YaHei"/>
+        </w:rPr>
+        <w:t xml:space="preserve">{ "cases": [{ "scene": "DATA", "turns": ["..."], "expect": {} }] }</w:t>
+      </w:r>
+      <w:r>
+        <w:rPr>
+          <w:b w:val="false"/>
+          <w:bCs w:val="false"/>
+          <w:color w:val="1A1A1A"/>
+          <w:sz w:val="24"/>
+          <w:szCs w:val="24"/>
+          <w:rFonts w:ascii="Times New Roman" w:eastAsia="SimSun"/>
+        </w:rPr>
+        <w:t xml:space="preserve"> 导入；无有效题目或非法题目会被拒绝/忽略。部署前先跑一次保存基线，后端激活 </w:t>
+      </w:r>
+      <w:r>
+        <w:rPr>
+          <w:b w:val="false"/>
+          <w:bCs w:val="false"/>
+          <w:color w:val="9C2B4B"/>
+          <w:sz w:val="24"/>
+          <w:szCs w:val="24"/>
+          <w:rFonts w:ascii="Consolas" w:eastAsia="Microsoft YaHei"/>
+        </w:rPr>
+        <w:t xml:space="preserve">Scene</w:t>
+      </w:r>
+      <w:r>
+        <w:rPr>
+          <w:b w:val="false"/>
+          <w:bCs w:val="false"/>
+          <w:color w:val="1A1A1A"/>
+          <w:sz w:val="24"/>
+          <w:szCs w:val="24"/>
+          <w:rFonts w:ascii="Times New Roman" w:eastAsia="SimSun"/>
+        </w:rPr>
+        <w:t xml:space="preserve"> 和 Agent 代码后再跑一次，比较通过率、场景边界失败数、工具拒绝数、平均轮数和耗时，报告随发布记录归档。</w:t>
+      </w:r>
+    </w:p>
+    <w:p>
+      <w:pPr>
+        <w:pStyle w:val="Heading1"/>
+        <w:pageBreakBefore/>
+        <w:spacing w:before="360" w:after="160" w:line="312"/>
+      </w:pPr>
+      <w:r>
+        <w:rPr>
+          <w:b/>
+          <w:bCs/>
+          <w:color w:val="1B6B7A"/>
+          <w:sz w:val="32"/>
+          <w:szCs w:val="32"/>
+          <w:rFonts w:ascii="Arial" w:eastAsia="SimHei"/>
+        </w:rPr>
+        <w:t xml:space="preserve">四、版本现状（截至 2026-10-11）</w:t>
+      </w:r>
+    </w:p>
+    <w:p>
+      <w:pPr>
+        <w:keepNext/>
+        <w:spacing w:line="312" w:after="60"/>
+        <w:ind w:firstLine="480"/>
+        <w:jc w:val="both"/>
+      </w:pPr>
+      <w:r>
+        <w:rPr>
+          <w:b/>
+          <w:bCs/>
+          <w:color w:val="1A1A1A"/>
+          <w:sz w:val="24"/>
+          <w:szCs w:val="24"/>
+          <w:rFonts w:ascii="Times New Roman" w:eastAsia="SimSun"/>
+        </w:rPr>
+        <w:t xml:space="preserve">已完成本地代码与协议核对</w:t>
+      </w:r>
+      <w:r>
+        <w:rPr>
+          <w:b w:val="false"/>
+          <w:bCs w:val="false"/>
+          <w:color w:val="1A1A1A"/>
+          <w:sz w:val="24"/>
+          <w:szCs w:val="24"/>
+          <w:rFonts w:ascii="Times New Roman" w:eastAsia="SimSun"/>
+        </w:rPr>
+        <w:t xml:space="preserve">：前端构建链路可执行；SAP 端 A/B 批仍需按实施文档逐项激活和真实数据验收。</w:t>
       </w:r>
     </w:p>
     <w:tbl>
@@ -3636,7 +4590,7 @@
                 <w:szCs w:val="20"/>
                 <w:rFonts w:ascii="Times New Roman" w:eastAsia="SimSun"/>
               </w:rPr>
-              <w:t xml:space="preserve">V8.3（含 3 个联调补丁）</w:t>
+              <w:t xml:space="preserve">Agent 场景增量（基于 V8.3）</w:t>
             </w:r>
           </w:p>
         </w:tc>
@@ -3664,62 +4618,7 @@
                 <w:szCs w:val="20"/>
                 <w:rFonts w:ascii="Times New Roman" w:eastAsia="SimSun"/>
               </w:rPr>
-              <w:t xml:space="preserve">V8.1 CSRF 先取 token；V8.2 强制 </w:t>
-            </w:r>
-            <w:r>
-              <w:rPr>
-                <w:b w:val="false"/>
-                <w:bCs w:val="false"/>
-                <w:color w:val="9C2B4B"/>
-                <w:sz w:val="20"/>
-                <w:szCs w:val="20"/>
-                <w:rFonts w:ascii="Consolas" w:eastAsia="Microsoft YaHei"/>
-              </w:rPr>
-              <w:t xml:space="preserve">Accept: application/json</w:t>
-            </w:r>
-            <w:r>
-              <w:rPr>
-                <w:b w:val="false"/>
-                <w:bCs w:val="false"/>
-                <w:color w:val="1A1A1A"/>
-                <w:sz w:val="20"/>
-                <w:szCs w:val="20"/>
-                <w:rFonts w:ascii="Times New Roman" w:eastAsia="SimSun"/>
-              </w:rPr>
-              <w:t xml:space="preserve">；V8.3 函数导入返回剥壳 </w:t>
-            </w:r>
-            <w:r>
-              <w:rPr>
-                <w:b w:val="false"/>
-                <w:bCs w:val="false"/>
-                <w:color w:val="9C2B4B"/>
-                <w:sz w:val="20"/>
-                <w:szCs w:val="20"/>
-                <w:rFonts w:ascii="Consolas" w:eastAsia="Microsoft YaHei"/>
-              </w:rPr>
-              <w:t xml:space="preserve">d.Login</w:t>
-            </w:r>
-            <w:r>
-              <w:rPr>
-                <w:b w:val="false"/>
-                <w:bCs w:val="false"/>
-                <w:color w:val="1A1A1A"/>
-                <w:sz w:val="20"/>
-                <w:szCs w:val="20"/>
-                <w:rFonts w:ascii="Times New Roman" w:eastAsia="SimSun"/>
-              </w:rPr>
-              <w:t xml:space="preserve"> / </w:t>
-            </w:r>
-            <w:r>
-              <w:rPr>
-                <w:b w:val="false"/>
-                <w:bCs w:val="false"/>
-                <w:color w:val="9C2B4B"/>
-                <w:sz w:val="20"/>
-                <w:szCs w:val="20"/>
-                <w:rFonts w:ascii="Consolas" w:eastAsia="Microsoft YaHei"/>
-              </w:rPr>
-              <w:t xml:space="preserve">d[sAction]</w:t>
+              <w:t xml:space="preserve">场景选择、模型白名单过滤、聚焦报表结果、图表紧跟来源表格、对话页 SAP 对象转 Agent 提示、管理员 Agent 测评（29 题）</w:t>
             </w:r>
           </w:p>
         </w:tc>
@@ -3780,7 +4679,7 @@
                 <w:szCs w:val="20"/>
                 <w:rFonts w:ascii="Times New Roman" w:eastAsia="SimSun"/>
               </w:rPr>
-              <w:t xml:space="preserve">V8.4</w:t>
+              <w:t xml:space="preserve">A/B 批（2026-10-11）</w:t>
             </w:r>
           </w:p>
         </w:tc>
@@ -3803,45 +4702,34 @@
               <w:rPr>
                 <w:b w:val="false"/>
                 <w:bCs w:val="false"/>
+                <w:color w:val="1A1A1A"/>
+                <w:sz w:val="20"/>
+                <w:szCs w:val="20"/>
+                <w:rFonts w:ascii="Times New Roman" w:eastAsia="SimSun"/>
+              </w:rPr>
+              <w:t xml:space="preserve">报表作业自动释放与失败回写；结果列并集；结果追问上下文；CODE 源码工具；</w:t>
+            </w:r>
+            <w:r>
+              <w:rPr>
+                <w:b w:val="false"/>
+                <w:bCs w:val="false"/>
                 <w:color w:val="9C2B4B"/>
                 <w:sz w:val="20"/>
                 <w:szCs w:val="20"/>
                 <w:rFonts w:ascii="Consolas" w:eastAsia="Microsoft YaHei"/>
               </w:rPr>
-              <w:t xml:space="preserve">GET_TABLE_SAMPLE</w:t>
-            </w:r>
-            <w:r>
-              <w:rPr>
-                <w:b w:val="false"/>
-                <w:bCs w:val="false"/>
-                <w:color w:val="1A1A1A"/>
-                <w:sz w:val="20"/>
-                <w:szCs w:val="20"/>
-                <w:rFonts w:ascii="Times New Roman" w:eastAsia="SimSun"/>
-              </w:rPr>
-              <w:t xml:space="preserve"> 用 </w:t>
-            </w:r>
-            <w:r>
-              <w:rPr>
-                <w:b w:val="false"/>
-                <w:bCs w:val="false"/>
-                <w:color w:val="9C2B4B"/>
-                <w:sz w:val="20"/>
-                <w:szCs w:val="20"/>
-                <w:rFonts w:ascii="Consolas" w:eastAsia="Microsoft YaHei"/>
-              </w:rPr>
-              <w:t xml:space="preserve">cl_abap_tabledescr + get_table_line_type()</w:t>
-            </w:r>
-            <w:r>
-              <w:rPr>
-                <w:b w:val="false"/>
-                <w:bCs w:val="false"/>
-                <w:color w:val="1A1A1A"/>
-                <w:sz w:val="20"/>
-                <w:szCs w:val="20"/>
-                <w:rFonts w:ascii="Times New Roman" w:eastAsia="SimSun"/>
-              </w:rPr>
-              <w:t xml:space="preserve"> 修复转型异常（MARA 取样 50 行验证通过）</w:t>
+              <w:t xml:space="preserve">AnalyzeTask.Scene</w:t>
+            </w:r>
+            <w:r>
+              <w:rPr>
+                <w:b w:val="false"/>
+                <w:bCs w:val="false"/>
+                <w:color w:val="1A1A1A"/>
+                <w:sz w:val="20"/>
+                <w:szCs w:val="20"/>
+                <w:rFonts w:ascii="Times New Roman" w:eastAsia="SimSun"/>
+              </w:rPr>
+              <w:t xml:space="preserve">；Agent 模型白名单</w:t>
             </w:r>
           </w:p>
         </w:tc>
@@ -3857,7 +4745,6 @@
         <w:pStyle w:val="Heading2"/>
         <w:spacing w:before="240" w:after="120" w:line="312"/>
       </w:pPr>
-      <w:bookmarkStart w:id="100008" w:name="_Toc100008"/>
       <w:r>
         <w:rPr>
           <w:b/>
@@ -3869,7 +4756,6 @@
         </w:rPr>
         <w:t xml:space="preserve">版本演进史一览</w:t>
       </w:r>
-      <w:bookmarkEnd w:id="100008"/>
     </w:p>
     <w:tbl>
       <w:tblPr>
@@ -4515,6 +5401,139 @@
           </w:p>
         </w:tc>
       </w:tr>
+      <w:tr>
+        <w:trPr>
+          <w:cantSplit/>
+        </w:trPr>
+        <w:tc>
+          <w:tcPr>
+            <w:tcW w:type="pct" w:w="33%"/>
+            <w:tcMar>
+              <w:top w:type="dxa" w:w="60"/>
+              <w:left w:type="dxa" w:w="120"/>
+              <w:bottom w:type="dxa" w:w="60"/>
+              <w:right w:type="dxa" w:w="120"/>
+            </w:tcMar>
+          </w:tcPr>
+          <w:p>
+            <w:pPr>
+              <w:spacing w:line="276"/>
+              <w:jc w:val="left"/>
+            </w:pPr>
+            <w:r>
+              <w:rPr>
+                <w:b w:val="false"/>
+                <w:bCs w:val="false"/>
+                <w:color w:val="1A1A1A"/>
+                <w:sz w:val="20"/>
+                <w:szCs w:val="20"/>
+                <w:rFonts w:ascii="Times New Roman" w:eastAsia="SimSun"/>
+              </w:rPr>
+              <w:t xml:space="preserve">10-11</w:t>
+            </w:r>
+          </w:p>
+        </w:tc>
+        <w:tc>
+          <w:tcPr>
+            <w:tcW w:type="pct" w:w="33%"/>
+            <w:tcMar>
+              <w:top w:type="dxa" w:w="60"/>
+              <w:left w:type="dxa" w:w="120"/>
+              <w:bottom w:type="dxa" w:w="60"/>
+              <w:right w:type="dxa" w:w="120"/>
+            </w:tcMar>
+          </w:tcPr>
+          <w:p>
+            <w:pPr>
+              <w:spacing w:line="276"/>
+              <w:jc w:val="left"/>
+            </w:pPr>
+            <w:r>
+              <w:rPr>
+                <w:b w:val="false"/>
+                <w:bCs w:val="false"/>
+                <w:color w:val="1A1A1A"/>
+                <w:sz w:val="20"/>
+                <w:szCs w:val="20"/>
+                <w:rFonts w:ascii="Times New Roman" w:eastAsia="SimSun"/>
+              </w:rPr>
+              <w:t xml:space="preserve">A/B 批</w:t>
+            </w:r>
+          </w:p>
+        </w:tc>
+        <w:tc>
+          <w:tcPr>
+            <w:tcW w:type="pct" w:w="34%"/>
+            <w:tcMar>
+              <w:top w:type="dxa" w:w="60"/>
+              <w:left w:type="dxa" w:w="120"/>
+              <w:bottom w:type="dxa" w:w="60"/>
+              <w:right w:type="dxa" w:w="120"/>
+            </w:tcMar>
+          </w:tcPr>
+          <w:p>
+            <w:pPr>
+              <w:spacing w:line="276"/>
+              <w:jc w:val="left"/>
+            </w:pPr>
+            <w:r>
+              <w:rPr>
+                <w:b w:val="false"/>
+                <w:bCs w:val="false"/>
+                <w:color w:val="1A1A1A"/>
+                <w:sz w:val="20"/>
+                <w:szCs w:val="20"/>
+                <w:rFonts w:ascii="Times New Roman" w:eastAsia="SimSun"/>
+              </w:rPr>
+              <w:t xml:space="preserve">后端 9 个对象整类/整程序替换；SEGW 给 </w:t>
+            </w:r>
+            <w:r>
+              <w:rPr>
+                <w:b w:val="false"/>
+                <w:bCs w:val="false"/>
+                <w:color w:val="9C2B4B"/>
+                <w:sz w:val="20"/>
+                <w:szCs w:val="20"/>
+                <w:rFonts w:ascii="Consolas" w:eastAsia="Microsoft YaHei"/>
+              </w:rPr>
+              <w:t xml:space="preserve">AnalyzeTask</w:t>
+            </w:r>
+            <w:r>
+              <w:rPr>
+                <w:b w:val="false"/>
+                <w:bCs w:val="false"/>
+                <w:color w:val="1A1A1A"/>
+                <w:sz w:val="20"/>
+                <w:szCs w:val="20"/>
+                <w:rFonts w:ascii="Times New Roman" w:eastAsia="SimSun"/>
+              </w:rPr>
+              <w:t xml:space="preserve"> 增加 </w:t>
+            </w:r>
+            <w:r>
+              <w:rPr>
+                <w:b w:val="false"/>
+                <w:bCs w:val="false"/>
+                <w:color w:val="9C2B4B"/>
+                <w:sz w:val="20"/>
+                <w:szCs w:val="20"/>
+                <w:rFonts w:ascii="Consolas" w:eastAsia="Microsoft YaHei"/>
+              </w:rPr>
+              <w:t xml:space="preserve">Scene</w:t>
+            </w:r>
+            <w:r>
+              <w:rPr>
+                <w:b w:val="false"/>
+                <w:bCs w:val="false"/>
+                <w:color w:val="1A1A1A"/>
+                <w:sz w:val="20"/>
+                <w:szCs w:val="20"/>
+                <w:rFonts w:ascii="Times New Roman" w:eastAsia="SimSun"/>
+              </w:rPr>
+              <w:t xml:space="preserve">；前端 Agent 场景与模型白名单；部署顺序和验收见 03 文档“〇-A”</w:t>
+            </w:r>
+          </w:p>
+        </w:tc>
+      </w:tr>
     </w:tbl>
     <w:p>
       <w:pPr>
@@ -4527,7 +5546,6 @@
         <w:pageBreakBefore/>
         <w:spacing w:before="360" w:after="160" w:line="312"/>
       </w:pPr>
-      <w:bookmarkStart w:id="100009" w:name="_Toc100009"/>
       <w:r>
         <w:rPr>
           <w:b/>
@@ -4539,7 +5557,6 @@
         </w:rPr>
         <w:t xml:space="preserve">五、与"纯后端 ABAP Tcode 对话框"的差异（重点）</w:t>
       </w:r>
-      <w:bookmarkEnd w:id="100009"/>
     </w:p>
     <w:p>
       <w:pPr>
@@ -4586,7 +5603,6 @@
         <w:pStyle w:val="Heading2"/>
         <w:spacing w:before="240" w:after="120" w:line="312"/>
       </w:pPr>
-      <w:bookmarkStart w:id="100010" w:name="_Toc100010"/>
       <w:r>
         <w:rPr>
           <w:b/>
@@ -4598,7 +5614,6 @@
         </w:rPr>
         <w:t xml:space="preserve">5.1 架构对比</w:t>
       </w:r>
-      <w:bookmarkEnd w:id="100010"/>
     </w:p>
     <w:tbl>
       <w:tblPr>
@@ -5166,7 +6181,6 @@
         <w:pStyle w:val="Heading2"/>
         <w:spacing w:before="240" w:after="120" w:line="312"/>
       </w:pPr>
-      <w:bookmarkStart w:id="100011" w:name="_Toc100011"/>
       <w:r>
         <w:rPr>
           <w:b/>
@@ -5178,7 +6192,6 @@
         </w:rPr>
         <w:t xml:space="preserve">5.2 大模型场景的适配性（核心差异）</w:t>
       </w:r>
-      <w:bookmarkEnd w:id="100011"/>
     </w:p>
     <w:p>
       <w:pPr>
@@ -5467,7 +6480,6 @@
         <w:pStyle w:val="Heading2"/>
         <w:spacing w:before="240" w:after="120" w:line="312"/>
       </w:pPr>
-      <w:bookmarkStart w:id="100012" w:name="_Toc100012"/>
       <w:r>
         <w:rPr>
           <w:b/>
@@ -5479,7 +6491,6 @@
         </w:rPr>
         <w:t xml:space="preserve">5.3 用户体验对比</w:t>
       </w:r>
-      <w:bookmarkEnd w:id="100012"/>
     </w:p>
     <w:tbl>
       <w:tblPr>
@@ -6047,7 +7058,6 @@
         <w:pStyle w:val="Heading2"/>
         <w:spacing w:before="240" w:after="120" w:line="312"/>
       </w:pPr>
-      <w:bookmarkStart w:id="100013" w:name="_Toc100013"/>
       <w:r>
         <w:rPr>
           <w:b/>
@@ -6059,7 +7069,6 @@
         </w:rPr>
         <w:t xml:space="preserve">5.4 安全与权限对比</w:t>
       </w:r>
-      <w:bookmarkEnd w:id="100013"/>
     </w:p>
     <w:tbl>
       <w:tblPr>
@@ -6582,7 +7591,6 @@
         <w:pStyle w:val="Heading2"/>
         <w:spacing w:before="240" w:after="120" w:line="312"/>
       </w:pPr>
-      <w:bookmarkStart w:id="100014" w:name="_Toc100014"/>
       <w:r>
         <w:rPr>
           <w:b/>
@@ -6594,7 +7602,6 @@
         </w:rPr>
         <w:t xml:space="preserve">5.5 传输与运维对比</w:t>
       </w:r>
-      <w:bookmarkEnd w:id="100014"/>
     </w:p>
     <w:p>
       <w:pPr>
@@ -6755,7 +7762,6 @@
         <w:pStyle w:val="Heading2"/>
         <w:spacing w:before="240" w:after="120" w:line="312"/>
       </w:pPr>
-      <w:bookmarkStart w:id="100015" w:name="_Toc100015"/>
       <w:r>
         <w:rPr>
           <w:b/>
@@ -6767,7 +7773,6 @@
         </w:rPr>
         <w:t xml:space="preserve">5.6 什么时候仍应选纯 ABAP Tcode</w:t>
       </w:r>
-      <w:bookmarkEnd w:id="100015"/>
     </w:p>
     <w:p>
       <w:pPr>
@@ -6943,7 +7948,6 @@
         <w:pageBreakBefore/>
         <w:spacing w:before="360" w:after="160" w:line="312"/>
       </w:pPr>
-      <w:bookmarkStart w:id="100016" w:name="_Toc100016"/>
       <w:r>
         <w:rPr>
           <w:b/>
@@ -6955,7 +7959,6 @@
         </w:rPr>
         <w:t xml:space="preserve">六、文档地图（本套整理版）</w:t>
       </w:r>
-      <w:bookmarkEnd w:id="100016"/>
     </w:p>
     <w:tbl>
       <w:tblPr>
@@ -7223,7 +8226,7 @@
                 <w:szCs w:val="20"/>
                 <w:rFonts w:ascii="Times New Roman" w:eastAsia="SimSun"/>
               </w:rPr>
-              <w:t xml:space="preserve">7 表/12 接口/4 类的设计与代码结构、核心流程、协议细节、坑档案</w:t>
+              <w:t xml:space="preserve">当前 20 个 ABAP 对象、4 EntityType/6 ComplexType/22 FI、场景协议、报表结果和模型白名单</w:t>
             </w:r>
           </w:p>
         </w:tc>
@@ -7544,7 +8547,7 @@
           <w:szCs w:val="24"/>
           <w:rFonts w:ascii="Times New Roman" w:eastAsia="SimSun"/>
         </w:rPr>
-        <w:t xml:space="preserve">历史文档（V1.0~V2.1 各版手册、设计文档、快照）的内容已全部并入上述五篇，原件于 2026-09-06 清理删除；版本沿革流水见仓库根 </w:t>
+        <w:t xml:space="preserve">历史文档（V1.0~V2.1 各版手册、设计文档、快照）的内容已并入上述主文档；本批源代码对象和部署顺序以 </w:t>
       </w:r>
       <w:r>
         <w:rPr>
@@ -7555,6 +8558,28 @@
           <w:szCs w:val="24"/>
           <w:rFonts w:ascii="Consolas" w:eastAsia="Microsoft YaHei"/>
         </w:rPr>
+        <w:t xml:space="preserve">backend-abap/00_对象清单与部署顺序_20261011.md</w:t>
+      </w:r>
+      <w:r>
+        <w:rPr>
+          <w:b w:val="false"/>
+          <w:bCs w:val="false"/>
+          <w:color w:val="1A1A1A"/>
+          <w:sz w:val="24"/>
+          <w:szCs w:val="24"/>
+          <w:rFonts w:ascii="Times New Roman" w:eastAsia="SimSun"/>
+        </w:rPr>
+        <w:t xml:space="preserve"> 为唯一事实源，版本沿革流水见仓库根 </w:t>
+      </w:r>
+      <w:r>
+        <w:rPr>
+          <w:b w:val="false"/>
+          <w:bCs w:val="false"/>
+          <w:color w:val="9C2B4B"/>
+          <w:sz w:val="24"/>
+          <w:szCs w:val="24"/>
+          <w:rFonts w:ascii="Consolas" w:eastAsia="Microsoft YaHei"/>
+        </w:rPr>
         <w:t xml:space="preserve">CHANGE-HIGHLIGHTS.md</w:t>
       </w:r>
       <w:r>
@@ -7575,7 +8600,6 @@
         <w:pageBreakBefore/>
         <w:spacing w:before="360" w:after="160" w:line="312"/>
       </w:pPr>
-      <w:bookmarkStart w:id="100017" w:name="_Toc100017"/>
       <w:r>
         <w:rPr>
           <w:b/>
@@ -7587,7 +8611,6 @@
         </w:rPr>
         <w:t xml:space="preserve">七、本地运行速查</w:t>
       </w:r>
-      <w:bookmarkEnd w:id="100017"/>
     </w:p>
     <w:tbl>
       <w:tblPr>
@@ -7806,7 +8829,7 @@
         <w:szCs w:val="18"/>
       </w:rPr>
       <w:fldChar w:fldCharType="begin"/>
-      <w:instrText xml:space="preserve"> PAGE \* ROMAN \* MERGEFORMAT </w:instrText>
+      <w:instrText xml:space="preserve">PAGE</w:instrText>
       <w:fldChar w:fldCharType="separate"/>
       <w:fldChar w:fldCharType="end"/>
     </w:r>
@@ -7827,7 +8850,7 @@
         <w:szCs w:val="18"/>
       </w:rPr>
       <w:fldChar w:fldCharType="begin"/>
-      <w:instrText xml:space="preserve"> PAGE \* arabic \* MERGEFORMAT </w:instrText>
+      <w:instrText xml:space="preserve">PAGE</w:instrText>
       <w:fldChar w:fldCharType="separate"/>
       <w:fldChar w:fldCharType="end"/>
     </w:r>
@@ -8131,7 +9154,6 @@
     <w:qFormat/>
     <w:pPr>
       <w:spacing w:before="360" w:after="160" w:line="312"/>
-      <w:outlineLvl w:val="0"/>
     </w:pPr>
     <w:rPr>
       <w:b/>
@@ -8149,7 +9171,6 @@
     <w:qFormat/>
     <w:pPr>
       <w:spacing w:before="240" w:after="120" w:line="312"/>
-      <w:outlineLvl w:val="1"/>
     </w:pPr>
     <w:rPr>
       <w:b/>
@@ -8167,7 +9188,6 @@
     <w:qFormat/>
     <w:pPr>
       <w:spacing w:before="200" w:after="100" w:line="312"/>
-      <w:outlineLvl w:val="2"/>
     </w:pPr>
     <w:rPr>
       <w:b/>
@@ -8185,7 +9205,6 @@
     <w:qFormat/>
     <w:pPr>
       <w:spacing w:before="180" w:after="80" w:line="312"/>
-      <w:outlineLvl w:val="3"/>
     </w:pPr>
     <w:rPr>
       <w:b/>
@@ -8197,9 +9216,6 @@
     </w:rPr>
   </w:style>
   <w:style w:type="paragraph" w:styleId="Heading5">
-    <w:pPr>
-      <w:outlineLvl w:val="4"/>
-    </w:pPr>
     <w:name w:val="Heading 5"/>
     <w:basedOn w:val="Normal"/>
     <w:next w:val="Normal"/>
@@ -8209,9 +9225,6 @@
     </w:rPr>
   </w:style>
   <w:style w:type="paragraph" w:styleId="Heading6">
-    <w:pPr>
-      <w:outlineLvl w:val="5"/>
-    </w:pPr>
     <w:name w:val="Heading 6"/>
     <w:basedOn w:val="Normal"/>
     <w:next w:val="Normal"/>
@@ -8282,44 +9295,5 @@
       <w:szCs w:val="20"/>
     </w:rPr>
   </w:style>
-  <w:style xmlns:w="http://schemas.openxmlformats.org/wordprocessingml/2006/main" w:type="paragraph" w:styleId="9">
-    <w:name w:val="toc 1"/>
-    <w:basedOn w:val="Normal"/>
-    <w:uiPriority w:val="39"/>
-    <w:pPr>
-      <w:tabs>
-        <w:tab w:val="right" w:leader="dot" w:pos="9026"/>
-      </w:tabs>
-      <w:spacing w:before="120" w:after="60"/>
-    </w:pPr>
-    <w:rPr>
-      <w:b/>
-      <w:bCs/>
-    </w:rPr>
-  </w:style>
-  <w:style xmlns:w="http://schemas.openxmlformats.org/wordprocessingml/2006/main" w:type="paragraph" w:styleId="11">
-    <w:name w:val="toc 2"/>
-    <w:basedOn w:val="Normal"/>
-    <w:uiPriority w:val="39"/>
-    <w:pPr>
-      <w:tabs>
-        <w:tab w:val="right" w:leader="dot" w:pos="9026"/>
-      </w:tabs>
-      <w:ind w:left="360"/>
-      <w:spacing w:before="60" w:after="40"/>
-    </w:pPr>
-  </w:style>
-  <w:style xmlns:w="http://schemas.openxmlformats.org/wordprocessingml/2006/main" w:type="paragraph" w:styleId="12">
-    <w:name w:val="toc 3"/>
-    <w:basedOn w:val="Normal"/>
-    <w:uiPriority w:val="39"/>
-    <w:pPr>
-      <w:tabs>
-        <w:tab w:val="right" w:leader="dot" w:pos="9026"/>
-      </w:tabs>
-      <w:ind w:left="720"/>
-      <w:spacing w:before="40" w:after="20"/>
-    </w:pPr>
-  </w:style>
 </w:styles>
 </file>
</xml_diff>